<commit_message>
Rebuild the Day 5 Word documents; use one Edge profile on G: for the figure capture
Co-Authored-By: Claude Sonnet 5.5 <noreply@anthropic.com>
</commit_message>
<xml_diff>
--- a/docx/Day5-Materi-AION-UX-Developer-Fitts-Hick-and-Miller-in-practice.docx
+++ b/docx/Day5-Materi-AION-UX-Developer-Fitts-Hick-and-Miller-in-practice.docx
@@ -2398,7 +2398,7 @@
             </w:r>
             <w:r>
               <w:rPr/>
-              <w:t xml:space="preserve"> One Ticketo checkout on a phone with three switches: a larger Pay button, placed where the thumb reaches, and space between the buttons.</w:t>
+              <w:t xml:space="preserve"> One Ticketo checkout on a phone with three switches: a larger Pay button, placed where the thumb reaches, and space between the buttons. A table of Fitts's law in numbers follows.</w:t>
             </w:r>
           </w:p>
         </w:tc>
@@ -2777,6 +2777,319 @@
         <w:spacing w:before="0" w:after="80"/>
       </w:pPr>
     </w:p>
+    <w:p>
+      <w:pPr>
+        <w:spacing w:before="0" w:after="100"/>
+      </w:pPr>
+      <w:r>
+        <w:rPr>
+          <w:b/>
+        </w:rPr>
+        <w:t>Fitts's law in numbers</w:t>
+      </w:r>
+    </w:p>
+    <w:tbl>
+      <w:tblPr>
+        <w:tblW w:w="9638" w:type="dxa"/>
+        <w:tblBorders>
+          <w:top w:val="single" w:sz="4" w:space="0" w:color="D5DEE9"/>
+          <w:left w:val="single" w:sz="4" w:space="0" w:color="D5DEE9"/>
+          <w:bottom w:val="single" w:sz="4" w:space="0" w:color="D5DEE9"/>
+          <w:right w:val="single" w:sz="4" w:space="0" w:color="D5DEE9"/>
+          <w:insideH w:val="single" w:sz="4" w:space="0" w:color="D5DEE9"/>
+          <w:insideV w:val="single" w:sz="4" w:space="0" w:color="D5DEE9"/>
+        </w:tblBorders>
+        <w:tblLayout w:type="fixed"/>
+        <w:tblCellMar>
+          <w:top w:w="60" w:type="dxa"/>
+          <w:left w:w="100" w:type="dxa"/>
+          <w:bottom w:w="60" w:type="dxa"/>
+          <w:right w:w="100" w:type="dxa"/>
+        </w:tblCellMar>
+      </w:tblPr>
+      <w:tblGrid>
+        <w:gridCol w:w="1321"/>
+        <w:gridCol w:w="5158"/>
+        <w:gridCol w:w="3159"/>
+      </w:tblGrid>
+      <w:tr>
+        <w:trPr>
+          <w:cantSplit/>
+          <w:tblHeader/>
+        </w:trPr>
+        <w:tc>
+          <w:tcPr>
+            <w:tcW w:type="dxa" w:w="1321"/>
+            <w:shd w:val="clear" w:color="auto" w:fill="E6ECF4"/>
+          </w:tcPr>
+          <w:p>
+            <w:pPr>
+              <w:spacing w:before="0" w:after="0"/>
+            </w:pPr>
+            <w:r>
+              <w:rPr>
+                <w:b/>
+                <w:sz w:val="20"/>
+              </w:rPr>
+              <w:t>Topic</w:t>
+            </w:r>
+          </w:p>
+        </w:tc>
+        <w:tc>
+          <w:tcPr>
+            <w:tcW w:type="dxa" w:w="5158"/>
+            <w:shd w:val="clear" w:color="auto" w:fill="E6ECF4"/>
+          </w:tcPr>
+          <w:p>
+            <w:pPr>
+              <w:spacing w:before="0" w:after="0"/>
+            </w:pPr>
+            <w:r>
+              <w:rPr>
+                <w:b/>
+                <w:sz w:val="20"/>
+              </w:rPr>
+              <w:t>Real finding or rule</w:t>
+            </w:r>
+          </w:p>
+        </w:tc>
+        <w:tc>
+          <w:tcPr>
+            <w:tcW w:type="dxa" w:w="3159"/>
+            <w:shd w:val="clear" w:color="auto" w:fill="E6ECF4"/>
+          </w:tcPr>
+          <w:p>
+            <w:pPr>
+              <w:spacing w:before="0" w:after="0"/>
+            </w:pPr>
+            <w:r>
+              <w:rPr>
+                <w:b/>
+                <w:sz w:val="20"/>
+              </w:rPr>
+              <w:t>What it means for a screen</w:t>
+            </w:r>
+          </w:p>
+        </w:tc>
+      </w:tr>
+      <w:tr>
+        <w:trPr>
+          <w:cantSplit/>
+        </w:trPr>
+        <w:tc>
+          <w:tcPr>
+            <w:tcW w:type="dxa" w:w="1321"/>
+          </w:tcPr>
+          <w:p>
+            <w:pPr>
+              <w:spacing w:before="0" w:after="0"/>
+            </w:pPr>
+            <w:r>
+              <w:rPr>
+                <w:sz w:val="20"/>
+              </w:rPr>
+              <w:t>The law</w:t>
+            </w:r>
+          </w:p>
+        </w:tc>
+        <w:tc>
+          <w:tcPr>
+            <w:tcW w:type="dxa" w:w="5158"/>
+          </w:tcPr>
+          <w:p>
+            <w:pPr>
+              <w:spacing w:before="0" w:after="0"/>
+            </w:pPr>
+            <w:r>
+              <w:rPr>
+                <w:sz w:val="20"/>
+              </w:rPr>
+              <w:t>The time to hit a target grows with its distance D and shrinks with its width W. The form most used on screens is MT = a + b·log2(D/W + 1) (MacKenzie 1992; first described by Fitts 1954 as log2(2D/W)).</w:t>
+            </w:r>
+          </w:p>
+        </w:tc>
+        <w:tc>
+          <w:tcPr>
+            <w:tcW w:type="dxa" w:w="3159"/>
+          </w:tcPr>
+          <w:p>
+            <w:pPr>
+              <w:spacing w:before="0" w:after="0"/>
+            </w:pPr>
+            <w:r>
+              <w:rPr>
+                <w:sz w:val="20"/>
+              </w:rPr>
+              <w:t>Double the size or halve the distance, and the movement gets faster by the same step.</w:t>
+            </w:r>
+          </w:p>
+        </w:tc>
+      </w:tr>
+      <w:tr>
+        <w:trPr>
+          <w:cantSplit/>
+        </w:trPr>
+        <w:tc>
+          <w:tcPr>
+            <w:tcW w:type="dxa" w:w="1321"/>
+          </w:tcPr>
+          <w:p>
+            <w:pPr>
+              <w:spacing w:before="0" w:after="0"/>
+            </w:pPr>
+            <w:r>
+              <w:rPr>
+                <w:sz w:val="20"/>
+              </w:rPr>
+              <w:t>Thumb size</w:t>
+            </w:r>
+          </w:p>
+        </w:tc>
+        <w:tc>
+          <w:tcPr>
+            <w:tcW w:type="dxa" w:w="5158"/>
+          </w:tcPr>
+          <w:p>
+            <w:pPr>
+              <w:spacing w:before="0" w:after="0"/>
+            </w:pPr>
+            <w:r>
+              <w:rPr>
+                <w:sz w:val="20"/>
+              </w:rPr>
+              <w:t>A study of one-handed thumb use on a touch screen found that 9.2 mm was large enough for single targets and 9.6 mm for a sequence of taps (Parhi et al. 2006).</w:t>
+            </w:r>
+          </w:p>
+        </w:tc>
+        <w:tc>
+          <w:tcPr>
+            <w:tcW w:type="dxa" w:w="3159"/>
+          </w:tcPr>
+          <w:p>
+            <w:pPr>
+              <w:spacing w:before="0" w:after="0"/>
+            </w:pPr>
+            <w:r>
+              <w:rPr>
+                <w:sz w:val="20"/>
+              </w:rPr>
+              <w:t>Size the tap area for the thumb, not for the pointer; a label alone is often too small.</w:t>
+            </w:r>
+          </w:p>
+        </w:tc>
+      </w:tr>
+      <w:tr>
+        <w:trPr>
+          <w:cantSplit/>
+        </w:trPr>
+        <w:tc>
+          <w:tcPr>
+            <w:tcW w:type="dxa" w:w="1321"/>
+          </w:tcPr>
+          <w:p>
+            <w:pPr>
+              <w:spacing w:before="0" w:after="0"/>
+            </w:pPr>
+            <w:r>
+              <w:rPr>
+                <w:sz w:val="20"/>
+              </w:rPr>
+              <w:t>Hand and position</w:t>
+            </w:r>
+          </w:p>
+        </w:tc>
+        <w:tc>
+          <w:tcPr>
+            <w:tcW w:type="dxa" w:w="5158"/>
+          </w:tcPr>
+          <w:p>
+            <w:pPr>
+              <w:spacing w:before="0" w:after="0"/>
+            </w:pPr>
+            <w:r>
+              <w:rPr>
+                <w:sz w:val="20"/>
+              </w:rPr>
+              <w:t>Of 1,333 people observed using phones in public, 49% held the phone in one hand, 36% cradled it and 15% used two hands (Hoober 2013, as reported).</w:t>
+            </w:r>
+          </w:p>
+        </w:tc>
+        <w:tc>
+          <w:tcPr>
+            <w:tcW w:type="dxa" w:w="3159"/>
+          </w:tcPr>
+          <w:p>
+            <w:pPr>
+              <w:spacing w:before="0" w:after="0"/>
+            </w:pPr>
+            <w:r>
+              <w:rPr>
+                <w:sz w:val="20"/>
+              </w:rPr>
+              <w:t>Put the main action where a thumb on a one-handed grip reaches it.</w:t>
+            </w:r>
+          </w:p>
+        </w:tc>
+      </w:tr>
+      <w:tr>
+        <w:trPr>
+          <w:cantSplit/>
+        </w:trPr>
+        <w:tc>
+          <w:tcPr>
+            <w:tcW w:type="dxa" w:w="1321"/>
+          </w:tcPr>
+          <w:p>
+            <w:pPr>
+              <w:spacing w:before="0" w:after="0"/>
+            </w:pPr>
+            <w:r>
+              <w:rPr>
+                <w:sz w:val="20"/>
+              </w:rPr>
+              <w:t>Rules</w:t>
+            </w:r>
+          </w:p>
+        </w:tc>
+        <w:tc>
+          <w:tcPr>
+            <w:tcW w:type="dxa" w:w="5158"/>
+          </w:tcPr>
+          <w:p>
+            <w:pPr>
+              <w:spacing w:before="0" w:after="0"/>
+            </w:pPr>
+            <w:r>
+              <w:rPr>
+                <w:sz w:val="20"/>
+              </w:rPr>
+              <w:t>WCAG 2.2 asks for pointer targets of at least 24 by 24 CSS pixels (2.5.8, level AA, with a spacing exception) and 44 by 44 at level AAA (2.5.5).</w:t>
+            </w:r>
+          </w:p>
+        </w:tc>
+        <w:tc>
+          <w:tcPr>
+            <w:tcW w:type="dxa" w:w="3159"/>
+          </w:tcPr>
+          <w:p>
+            <w:pPr>
+              <w:spacing w:before="0" w:after="0"/>
+            </w:pPr>
+            <w:r>
+              <w:rPr>
+                <w:sz w:val="20"/>
+              </w:rPr>
+              <w:t>Check the size of the area that reacts and the space between neighbours.</w:t>
+            </w:r>
+          </w:p>
+        </w:tc>
+      </w:tr>
+    </w:tbl>
+    <w:p>
+      <w:pPr>
+        <w:spacing w:before="0" w:after="80"/>
+      </w:pPr>
+    </w:p>
     <w:tbl>
       <w:tblPr>
         <w:tblW w:w="9598" w:type="dxa"/>
@@ -2826,7 +3139,7 @@
             </w:pPr>
             <w:r>
               <w:rPr/>
-              <w:t>Ticketo, Leon, Mara, Priya and Tobias are made up for this example. Fitts's law follows Fitts (1954) and, for screens, MacKenzie (1992); small targets under the thumb follow Parhi, Karlson and Bederson (2006); how people hold phones follows Hoober (2013); WCAG 2.2 sets a minimum target size in criterion 2.5.8.</w:t>
+              <w:t>Ticketo, Leon, Mara, Priya and Tobias are made up for this example. Fitts's law follows Fitts (1954) and, for screens, MacKenzie (1992); small targets under the thumb follow Parhi, Karlson and Bederson (2006); how people hold phones follows Hoober (2013); WCAG 2.2 sets a minimum target size in criterion 2.5.8. The findings in the table of real evidence are real research results, rules and cases; the sources are listed below.</w:t>
             </w:r>
           </w:p>
         </w:tc>
@@ -3015,7 +3328,7 @@
           <w:color w:val="556274"/>
           <w:sz w:val="18"/>
         </w:rPr>
-        <w:t>Fitts 1954 · MacKenzie 1992 · Parhi et al. 2006 · Hoober 2013 · WCAG 2.2</w:t>
+        <w:t>Fitts 1954 · MacKenzie 1992 · Parhi et al. 2006 · Hoober 2013 · WCAG 2.2 · Baymard Institute 2024</w:t>
       </w:r>
     </w:p>
     <w:p>
@@ -3129,7 +3442,7 @@
             </w:r>
             <w:r>
               <w:rPr/>
-              <w:t xml:space="preserve"> The same Ticketo choice in two forms: every showing of the week at once, and staged by day, film and time.</w:t>
+              <w:t xml:space="preserve"> The same Ticketo choice in two forms: every showing of the week at once, and staged by day, film and time. A table of evidence for lowering decision effort follows.</w:t>
             </w:r>
           </w:p>
         </w:tc>
@@ -3455,6 +3768,319 @@
         <w:spacing w:before="0" w:after="80"/>
       </w:pPr>
     </w:p>
+    <w:p>
+      <w:pPr>
+        <w:spacing w:before="0" w:after="100"/>
+      </w:pPr>
+      <w:r>
+        <w:rPr>
+          <w:b/>
+        </w:rPr>
+        <w:t>Lowering decision effort: evidence and limits</w:t>
+      </w:r>
+    </w:p>
+    <w:tbl>
+      <w:tblPr>
+        <w:tblW w:w="9638" w:type="dxa"/>
+        <w:tblBorders>
+          <w:top w:val="single" w:sz="4" w:space="0" w:color="D5DEE9"/>
+          <w:left w:val="single" w:sz="4" w:space="0" w:color="D5DEE9"/>
+          <w:bottom w:val="single" w:sz="4" w:space="0" w:color="D5DEE9"/>
+          <w:right w:val="single" w:sz="4" w:space="0" w:color="D5DEE9"/>
+          <w:insideH w:val="single" w:sz="4" w:space="0" w:color="D5DEE9"/>
+          <w:insideV w:val="single" w:sz="4" w:space="0" w:color="D5DEE9"/>
+        </w:tblBorders>
+        <w:tblLayout w:type="fixed"/>
+        <w:tblCellMar>
+          <w:top w:w="60" w:type="dxa"/>
+          <w:left w:w="100" w:type="dxa"/>
+          <w:bottom w:w="60" w:type="dxa"/>
+          <w:right w:w="100" w:type="dxa"/>
+        </w:tblCellMar>
+      </w:tblPr>
+      <w:tblGrid>
+        <w:gridCol w:w="1522"/>
+        <w:gridCol w:w="5273"/>
+        <w:gridCol w:w="2843"/>
+      </w:tblGrid>
+      <w:tr>
+        <w:trPr>
+          <w:cantSplit/>
+          <w:tblHeader/>
+        </w:trPr>
+        <w:tc>
+          <w:tcPr>
+            <w:tcW w:type="dxa" w:w="1522"/>
+            <w:shd w:val="clear" w:color="auto" w:fill="E6ECF4"/>
+          </w:tcPr>
+          <w:p>
+            <w:pPr>
+              <w:spacing w:before="0" w:after="0"/>
+            </w:pPr>
+            <w:r>
+              <w:rPr>
+                <w:b/>
+                <w:sz w:val="20"/>
+              </w:rPr>
+              <w:t>Lever</w:t>
+            </w:r>
+          </w:p>
+        </w:tc>
+        <w:tc>
+          <w:tcPr>
+            <w:tcW w:type="dxa" w:w="5273"/>
+            <w:shd w:val="clear" w:color="auto" w:fill="E6ECF4"/>
+          </w:tcPr>
+          <w:p>
+            <w:pPr>
+              <w:spacing w:before="0" w:after="0"/>
+            </w:pPr>
+            <w:r>
+              <w:rPr>
+                <w:b/>
+                <w:sz w:val="20"/>
+              </w:rPr>
+              <w:t>Real finding or rule</w:t>
+            </w:r>
+          </w:p>
+        </w:tc>
+        <w:tc>
+          <w:tcPr>
+            <w:tcW w:type="dxa" w:w="2843"/>
+            <w:shd w:val="clear" w:color="auto" w:fill="E6ECF4"/>
+          </w:tcPr>
+          <w:p>
+            <w:pPr>
+              <w:spacing w:before="0" w:after="0"/>
+            </w:pPr>
+            <w:r>
+              <w:rPr>
+                <w:b/>
+                <w:sz w:val="20"/>
+              </w:rPr>
+              <w:t>What it means for a screen</w:t>
+            </w:r>
+          </w:p>
+        </w:tc>
+      </w:tr>
+      <w:tr>
+        <w:trPr>
+          <w:cantSplit/>
+        </w:trPr>
+        <w:tc>
+          <w:tcPr>
+            <w:tcW w:type="dxa" w:w="1522"/>
+          </w:tcPr>
+          <w:p>
+            <w:pPr>
+              <w:spacing w:before="0" w:after="0"/>
+            </w:pPr>
+            <w:r>
+              <w:rPr>
+                <w:sz w:val="20"/>
+              </w:rPr>
+              <w:t>The law</w:t>
+            </w:r>
+          </w:p>
+        </w:tc>
+        <w:tc>
+          <w:tcPr>
+            <w:tcW w:type="dxa" w:w="5273"/>
+          </w:tcPr>
+          <w:p>
+            <w:pPr>
+              <w:spacing w:before="0" w:after="0"/>
+            </w:pPr>
+            <w:r>
+              <w:rPr>
+                <w:sz w:val="20"/>
+              </w:rPr>
+              <w:t>The time to choose grows with the logarithm of the number of equally likely options, RT = a + b·log2(n + 1): each doubling of the options adds one fixed step of time (Hick 1952; Hyman 1953).</w:t>
+            </w:r>
+          </w:p>
+        </w:tc>
+        <w:tc>
+          <w:tcPr>
+            <w:tcW w:type="dxa" w:w="2843"/>
+          </w:tcPr>
+          <w:p>
+            <w:pPr>
+              <w:spacing w:before="0" w:after="0"/>
+            </w:pPr>
+            <w:r>
+              <w:rPr>
+                <w:sz w:val="20"/>
+              </w:rPr>
+              <w:t>A few fewer options help most when the options are many and unfamiliar.</w:t>
+            </w:r>
+          </w:p>
+        </w:tc>
+      </w:tr>
+      <w:tr>
+        <w:trPr>
+          <w:cantSplit/>
+        </w:trPr>
+        <w:tc>
+          <w:tcPr>
+            <w:tcW w:type="dxa" w:w="1522"/>
+          </w:tcPr>
+          <w:p>
+            <w:pPr>
+              <w:spacing w:before="0" w:after="0"/>
+            </w:pPr>
+            <w:r>
+              <w:rPr>
+                <w:sz w:val="20"/>
+              </w:rPr>
+              <w:t>Fewer at once</w:t>
+            </w:r>
+          </w:p>
+        </w:tc>
+        <w:tc>
+          <w:tcPr>
+            <w:tcW w:type="dxa" w:w="5273"/>
+          </w:tcPr>
+          <w:p>
+            <w:pPr>
+              <w:spacing w:before="0" w:after="0"/>
+            </w:pPr>
+            <w:r>
+              <w:rPr>
+                <w:sz w:val="20"/>
+              </w:rPr>
+              <w:t>A display of 24 jams drew more stops and far fewer purchases than a display of 6 (Iyengar and Lepper 2000; a small study).</w:t>
+            </w:r>
+          </w:p>
+        </w:tc>
+        <w:tc>
+          <w:tcPr>
+            <w:tcW w:type="dxa" w:w="2843"/>
+          </w:tcPr>
+          <w:p>
+            <w:pPr>
+              <w:spacing w:before="0" w:after="0"/>
+            </w:pPr>
+            <w:r>
+              <w:rPr>
+                <w:sz w:val="20"/>
+              </w:rPr>
+              <w:t>Show a short list first; keep the rest one step away.</w:t>
+            </w:r>
+          </w:p>
+        </w:tc>
+      </w:tr>
+      <w:tr>
+        <w:trPr>
+          <w:cantSplit/>
+        </w:trPr>
+        <w:tc>
+          <w:tcPr>
+            <w:tcW w:type="dxa" w:w="1522"/>
+          </w:tcPr>
+          <w:p>
+            <w:pPr>
+              <w:spacing w:before="0" w:after="0"/>
+            </w:pPr>
+            <w:r>
+              <w:rPr>
+                <w:sz w:val="20"/>
+              </w:rPr>
+              <w:t>Staged choices</w:t>
+            </w:r>
+          </w:p>
+        </w:tc>
+        <w:tc>
+          <w:tcPr>
+            <w:tcW w:type="dxa" w:w="5273"/>
+          </w:tcPr>
+          <w:p>
+            <w:pPr>
+              <w:spacing w:before="0" w:after="0"/>
+            </w:pPr>
+            <w:r>
+              <w:rPr>
+                <w:sz w:val="20"/>
+              </w:rPr>
+              <w:t>In theory a design can have several levels of progressive disclosure; in practice designs with more than two levels usually have low usability because users get lost between them (Nielsen 2006).</w:t>
+            </w:r>
+          </w:p>
+        </w:tc>
+        <w:tc>
+          <w:tcPr>
+            <w:tcW w:type="dxa" w:w="2843"/>
+          </w:tcPr>
+          <w:p>
+            <w:pPr>
+              <w:spacing w:before="0" w:after="0"/>
+            </w:pPr>
+            <w:r>
+              <w:rPr>
+                <w:sz w:val="20"/>
+              </w:rPr>
+              <w:t>Stage a choice in at most two levels, and show where the person is.</w:t>
+            </w:r>
+          </w:p>
+        </w:tc>
+      </w:tr>
+      <w:tr>
+        <w:trPr>
+          <w:cantSplit/>
+        </w:trPr>
+        <w:tc>
+          <w:tcPr>
+            <w:tcW w:type="dxa" w:w="1522"/>
+          </w:tcPr>
+          <w:p>
+            <w:pPr>
+              <w:spacing w:before="0" w:after="0"/>
+            </w:pPr>
+            <w:r>
+              <w:rPr>
+                <w:sz w:val="20"/>
+              </w:rPr>
+              <w:t>Structure matters</w:t>
+            </w:r>
+          </w:p>
+        </w:tc>
+        <w:tc>
+          <w:tcPr>
+            <w:tcW w:type="dxa" w:w="5273"/>
+          </w:tcPr>
+          <w:p>
+            <w:pPr>
+              <w:spacing w:before="0" w:after="0"/>
+            </w:pPr>
+            <w:r>
+              <w:rPr>
+                <w:sz w:val="20"/>
+              </w:rPr>
+              <w:t>A medium structure of depth and breadth beat the broadest, shallowest one in a web search study (Larson and Czerwinski 1998).</w:t>
+            </w:r>
+          </w:p>
+        </w:tc>
+        <w:tc>
+          <w:tcPr>
+            <w:tcW w:type="dxa" w:w="2843"/>
+          </w:tcPr>
+          <w:p>
+            <w:pPr>
+              <w:spacing w:before="0" w:after="0"/>
+            </w:pPr>
+            <w:r>
+              <w:rPr>
+                <w:sz w:val="20"/>
+              </w:rPr>
+              <w:t>Do not trade a long list for many levels.</w:t>
+            </w:r>
+          </w:p>
+        </w:tc>
+      </w:tr>
+    </w:tbl>
+    <w:p>
+      <w:pPr>
+        <w:spacing w:before="0" w:after="80"/>
+      </w:pPr>
+    </w:p>
     <w:tbl>
       <w:tblPr>
         <w:tblW w:w="9598" w:type="dxa"/>
@@ -3504,7 +4130,7 @@
             </w:pPr>
             <w:r>
               <w:rPr/>
-              <w:t>Ticketo, Leon, Mara, Priya and Tobias are made up for this example. Hick's law follows Hick (1952) and Hyman (1953); many options making people choose less follows Iyengar and Lepper (2000); showing options in stages follows Nielsen (2006) on progressive disclosure.</w:t>
+              <w:t>Ticketo, Leon, Mara, Priya and Tobias are made up for this example. Hick's law follows Hick (1952) and Hyman (1953); many options making people choose less follows Iyengar and Lepper (2000); showing options in stages follows Nielsen (2006) on progressive disclosure. The findings in the table of real evidence are real research results, rules and cases; the sources are listed below.</w:t>
             </w:r>
           </w:p>
         </w:tc>
@@ -3693,7 +4319,7 @@
           <w:color w:val="556274"/>
           <w:sz w:val="18"/>
         </w:rPr>
-        <w:t>Hick 1952 · Hyman 1953 · Iyengar &amp; Lepper 2000 · Nielsen 2006</w:t>
+        <w:t>Hick 1952 · Hyman 1953 · Iyengar &amp; Lepper 2000 · Nielsen 2006 · Larson &amp; Czerwinski 1998</w:t>
       </w:r>
     </w:p>
     <w:p>
@@ -3807,7 +4433,7 @@
             </w:r>
             <w:r>
               <w:rPr/>
-              <w:t xml:space="preserve"> The same Ticketo confirmation twice: a long code and scattered details, and a chunked code with the details in one box.</w:t>
+              <w:t xml:space="preserve"> The same Ticketo confirmation twice: a long code and scattered details, and a chunked code with the details in one box. A table of evidence for chunking follows.</w:t>
             </w:r>
           </w:p>
         </w:tc>
@@ -4186,6 +4812,319 @@
         <w:spacing w:before="0" w:after="80"/>
       </w:pPr>
     </w:p>
+    <w:p>
+      <w:pPr>
+        <w:spacing w:before="0" w:after="100"/>
+      </w:pPr>
+      <w:r>
+        <w:rPr>
+          <w:b/>
+        </w:rPr>
+        <w:t>Chunking and structure: evidence</w:t>
+      </w:r>
+    </w:p>
+    <w:tbl>
+      <w:tblPr>
+        <w:tblW w:w="9638" w:type="dxa"/>
+        <w:tblBorders>
+          <w:top w:val="single" w:sz="4" w:space="0" w:color="D5DEE9"/>
+          <w:left w:val="single" w:sz="4" w:space="0" w:color="D5DEE9"/>
+          <w:bottom w:val="single" w:sz="4" w:space="0" w:color="D5DEE9"/>
+          <w:right w:val="single" w:sz="4" w:space="0" w:color="D5DEE9"/>
+          <w:insideH w:val="single" w:sz="4" w:space="0" w:color="D5DEE9"/>
+          <w:insideV w:val="single" w:sz="4" w:space="0" w:color="D5DEE9"/>
+        </w:tblBorders>
+        <w:tblLayout w:type="fixed"/>
+        <w:tblCellMar>
+          <w:top w:w="60" w:type="dxa"/>
+          <w:left w:w="100" w:type="dxa"/>
+          <w:bottom w:w="60" w:type="dxa"/>
+          <w:right w:w="100" w:type="dxa"/>
+        </w:tblCellMar>
+      </w:tblPr>
+      <w:tblGrid>
+        <w:gridCol w:w="1548"/>
+        <w:gridCol w:w="4979"/>
+        <w:gridCol w:w="3111"/>
+      </w:tblGrid>
+      <w:tr>
+        <w:trPr>
+          <w:cantSplit/>
+          <w:tblHeader/>
+        </w:trPr>
+        <w:tc>
+          <w:tcPr>
+            <w:tcW w:type="dxa" w:w="1548"/>
+            <w:shd w:val="clear" w:color="auto" w:fill="E6ECF4"/>
+          </w:tcPr>
+          <w:p>
+            <w:pPr>
+              <w:spacing w:before="0" w:after="0"/>
+            </w:pPr>
+            <w:r>
+              <w:rPr>
+                <w:b/>
+                <w:sz w:val="20"/>
+              </w:rPr>
+              <w:t>Finding</w:t>
+            </w:r>
+          </w:p>
+        </w:tc>
+        <w:tc>
+          <w:tcPr>
+            <w:tcW w:type="dxa" w:w="4979"/>
+            <w:shd w:val="clear" w:color="auto" w:fill="E6ECF4"/>
+          </w:tcPr>
+          <w:p>
+            <w:pPr>
+              <w:spacing w:before="0" w:after="0"/>
+            </w:pPr>
+            <w:r>
+              <w:rPr>
+                <w:b/>
+                <w:sz w:val="20"/>
+              </w:rPr>
+              <w:t>What it shows</w:t>
+            </w:r>
+          </w:p>
+        </w:tc>
+        <w:tc>
+          <w:tcPr>
+            <w:tcW w:type="dxa" w:w="3111"/>
+            <w:shd w:val="clear" w:color="auto" w:fill="E6ECF4"/>
+          </w:tcPr>
+          <w:p>
+            <w:pPr>
+              <w:spacing w:before="0" w:after="0"/>
+            </w:pPr>
+            <w:r>
+              <w:rPr>
+                <w:b/>
+                <w:sz w:val="20"/>
+              </w:rPr>
+              <w:t>What it means for a screen</w:t>
+            </w:r>
+          </w:p>
+        </w:tc>
+      </w:tr>
+      <w:tr>
+        <w:trPr>
+          <w:cantSplit/>
+        </w:trPr>
+        <w:tc>
+          <w:tcPr>
+            <w:tcW w:type="dxa" w:w="1548"/>
+          </w:tcPr>
+          <w:p>
+            <w:pPr>
+              <w:spacing w:before="0" w:after="0"/>
+            </w:pPr>
+            <w:r>
+              <w:rPr>
+                <w:sz w:val="20"/>
+              </w:rPr>
+              <w:t>Miller 1956 and Cowan 2001</w:t>
+            </w:r>
+          </w:p>
+        </w:tc>
+        <w:tc>
+          <w:tcPr>
+            <w:tcW w:type="dxa" w:w="4979"/>
+          </w:tcPr>
+          <w:p>
+            <w:pPr>
+              <w:spacing w:before="0" w:after="0"/>
+            </w:pPr>
+            <w:r>
+              <w:rPr>
+                <w:sz w:val="20"/>
+              </w:rPr>
+              <w:t>Miller described a span of about seven chunks; later work puts the limit nearer four chunks (Cowan 2001).</w:t>
+            </w:r>
+          </w:p>
+        </w:tc>
+        <w:tc>
+          <w:tcPr>
+            <w:tcW w:type="dxa" w:w="3111"/>
+          </w:tcPr>
+          <w:p>
+            <w:pPr>
+              <w:spacing w:before="0" w:after="0"/>
+            </w:pPr>
+            <w:r>
+              <w:rPr>
+                <w:sz w:val="20"/>
+              </w:rPr>
+              <w:t>Plan for four, and let the system hold what a person would have to remember.</w:t>
+            </w:r>
+          </w:p>
+        </w:tc>
+      </w:tr>
+      <w:tr>
+        <w:trPr>
+          <w:cantSplit/>
+        </w:trPr>
+        <w:tc>
+          <w:tcPr>
+            <w:tcW w:type="dxa" w:w="1548"/>
+          </w:tcPr>
+          <w:p>
+            <w:pPr>
+              <w:spacing w:before="0" w:after="0"/>
+            </w:pPr>
+            <w:r>
+              <w:rPr>
+                <w:sz w:val="20"/>
+              </w:rPr>
+              <w:t>What a chunk is</w:t>
+            </w:r>
+          </w:p>
+        </w:tc>
+        <w:tc>
+          <w:tcPr>
+            <w:tcW w:type="dxa" w:w="4979"/>
+          </w:tcPr>
+          <w:p>
+            <w:pPr>
+              <w:spacing w:before="0" w:after="0"/>
+            </w:pPr>
+            <w:r>
+              <w:rPr>
+                <w:sz w:val="20"/>
+              </w:rPr>
+              <w:t>A chunk is a unit that the person already knows as one thing (Gobet et al. 2001). Chess masters recalled 20 or more pieces from a real game position, in about five chunks; for pieces placed at random, every player recalled only three or four (Chase and Simon 1973, as reported).</w:t>
+            </w:r>
+          </w:p>
+        </w:tc>
+        <w:tc>
+          <w:tcPr>
+            <w:tcW w:type="dxa" w:w="3111"/>
+          </w:tcPr>
+          <w:p>
+            <w:pPr>
+              <w:spacing w:before="0" w:after="0"/>
+            </w:pPr>
+            <w:r>
+              <w:rPr>
+                <w:sz w:val="20"/>
+              </w:rPr>
+              <w:t>A grouping helps only if it matches a unit the user knows: a date, a phone number, a seat, a total.</w:t>
+            </w:r>
+          </w:p>
+        </w:tc>
+      </w:tr>
+      <w:tr>
+        <w:trPr>
+          <w:cantSplit/>
+        </w:trPr>
+        <w:tc>
+          <w:tcPr>
+            <w:tcW w:type="dxa" w:w="1548"/>
+          </w:tcPr>
+          <w:p>
+            <w:pPr>
+              <w:spacing w:before="0" w:after="0"/>
+            </w:pPr>
+            <w:r>
+              <w:rPr>
+                <w:sz w:val="20"/>
+              </w:rPr>
+              <w:t>Chunking in print</w:t>
+            </w:r>
+          </w:p>
+        </w:tc>
+        <w:tc>
+          <w:tcPr>
+            <w:tcW w:type="dxa" w:w="4979"/>
+          </w:tcPr>
+          <w:p>
+            <w:pPr>
+              <w:spacing w:before="0" w:after="0"/>
+            </w:pPr>
+            <w:r>
+              <w:rPr>
+                <w:sz w:val="20"/>
+              </w:rPr>
+              <w:t>UK postcodes are written in two parts, for example SW1A 1AA, and an IBAN in groups of four characters (ISO 13616).</w:t>
+            </w:r>
+          </w:p>
+        </w:tc>
+        <w:tc>
+          <w:tcPr>
+            <w:tcW w:type="dxa" w:w="3111"/>
+          </w:tcPr>
+          <w:p>
+            <w:pPr>
+              <w:spacing w:before="0" w:after="0"/>
+            </w:pPr>
+            <w:r>
+              <w:rPr>
+                <w:sz w:val="20"/>
+              </w:rPr>
+              <w:t>Break a long code into groups at the places where people read or type it.</w:t>
+            </w:r>
+          </w:p>
+        </w:tc>
+      </w:tr>
+      <w:tr>
+        <w:trPr>
+          <w:cantSplit/>
+        </w:trPr>
+        <w:tc>
+          <w:tcPr>
+            <w:tcW w:type="dxa" w:w="1548"/>
+          </w:tcPr>
+          <w:p>
+            <w:pPr>
+              <w:spacing w:before="0" w:after="0"/>
+            </w:pPr>
+            <w:r>
+              <w:rPr>
+                <w:sz w:val="20"/>
+              </w:rPr>
+              <w:t>Show where needed</w:t>
+            </w:r>
+          </w:p>
+        </w:tc>
+        <w:tc>
+          <w:tcPr>
+            <w:tcW w:type="dxa" w:w="4979"/>
+          </w:tcPr>
+          <w:p>
+            <w:pPr>
+              <w:spacing w:before="0" w:after="0"/>
+            </w:pPr>
+            <w:r>
+              <w:rPr>
+                <w:sz w:val="20"/>
+              </w:rPr>
+              <w:t>Effort spent on holding information that the screen could show is missing for the task (Sweller 1988).</w:t>
+            </w:r>
+          </w:p>
+        </w:tc>
+        <w:tc>
+          <w:tcPr>
+            <w:tcW w:type="dxa" w:w="3111"/>
+          </w:tcPr>
+          <w:p>
+            <w:pPr>
+              <w:spacing w:before="0" w:after="0"/>
+            </w:pPr>
+            <w:r>
+              <w:rPr>
+                <w:sz w:val="20"/>
+              </w:rPr>
+              <w:t>Show the conditions next to the choice they belong to.</w:t>
+            </w:r>
+          </w:p>
+        </w:tc>
+      </w:tr>
+    </w:tbl>
+    <w:p>
+      <w:pPr>
+        <w:spacing w:before="0" w:after="80"/>
+      </w:pPr>
+    </w:p>
     <w:tbl>
       <w:tblPr>
         <w:tblW w:w="9598" w:type="dxa"/>
@@ -4235,7 +5174,7 @@
             </w:pPr>
             <w:r>
               <w:rPr/>
-              <w:t>Ticketo, Leon, Mara, Priya and Tobias are made up for this example. The limits of short-term memory follow Miller (1956) and Cowan (2001); chunking follows Gobet et al. (2001); recognition rather than recall is Nielsen's heuristic (1994).</w:t>
+              <w:t>Ticketo, Leon, Mara, Priya and Tobias are made up for this example. The limits of short-term memory follow Miller (1956) and Cowan (2001); chunking follows Gobet et al. (2001); recognition rather than recall is Nielsen's heuristic (1994). The findings in the table of real evidence are real research results, rules and cases; the sources are listed below.</w:t>
             </w:r>
           </w:p>
         </w:tc>
@@ -4414,7 +5353,7 @@
           <w:color w:val="556274"/>
           <w:sz w:val="18"/>
         </w:rPr>
-        <w:t>Miller 1956 · Cowan 2001 · Gobet et al. 2001 · Nielsen 1994</w:t>
+        <w:t>Miller 1956 · Cowan 2001 · Gobet et al. 2001 · Nielsen 1994 · Chase &amp; Simon 1973 · ISO 13616 · Sweller 1988</w:t>
       </w:r>
     </w:p>
     <w:p>
@@ -4528,7 +5467,7 @@
             </w:r>
             <w:r>
               <w:rPr/>
-              <w:t xml:space="preserve"> One Ticketo menu with three switches, one per law: larger items, fewer items, and labels grouped by meaning.</w:t>
+              <w:t xml:space="preserve"> One Ticketo menu with three switches, one per law: larger items, fewer items, and labels grouped by meaning. A table of the limits of the person follows.</w:t>
             </w:r>
           </w:p>
         </w:tc>
@@ -4921,6 +5860,266 @@
         <w:spacing w:before="0" w:after="80"/>
       </w:pPr>
     </w:p>
+    <w:p>
+      <w:pPr>
+        <w:spacing w:before="0" w:after="100"/>
+      </w:pPr>
+      <w:r>
+        <w:rPr>
+          <w:b/>
+        </w:rPr>
+        <w:t>The three laws and the limits of the person</w:t>
+      </w:r>
+    </w:p>
+    <w:tbl>
+      <w:tblPr>
+        <w:tblW w:w="9638" w:type="dxa"/>
+        <w:tblBorders>
+          <w:top w:val="single" w:sz="4" w:space="0" w:color="D5DEE9"/>
+          <w:left w:val="single" w:sz="4" w:space="0" w:color="D5DEE9"/>
+          <w:bottom w:val="single" w:sz="4" w:space="0" w:color="D5DEE9"/>
+          <w:right w:val="single" w:sz="4" w:space="0" w:color="D5DEE9"/>
+          <w:insideH w:val="single" w:sz="4" w:space="0" w:color="D5DEE9"/>
+          <w:insideV w:val="single" w:sz="4" w:space="0" w:color="D5DEE9"/>
+        </w:tblBorders>
+        <w:tblLayout w:type="fixed"/>
+        <w:tblCellMar>
+          <w:top w:w="60" w:type="dxa"/>
+          <w:left w:w="100" w:type="dxa"/>
+          <w:bottom w:w="60" w:type="dxa"/>
+          <w:right w:w="100" w:type="dxa"/>
+        </w:tblCellMar>
+      </w:tblPr>
+      <w:tblGrid>
+        <w:gridCol w:w="1674"/>
+        <w:gridCol w:w="4630"/>
+        <w:gridCol w:w="3334"/>
+      </w:tblGrid>
+      <w:tr>
+        <w:trPr>
+          <w:cantSplit/>
+          <w:tblHeader/>
+        </w:trPr>
+        <w:tc>
+          <w:tcPr>
+            <w:tcW w:type="dxa" w:w="1674"/>
+            <w:shd w:val="clear" w:color="auto" w:fill="E6ECF4"/>
+          </w:tcPr>
+          <w:p>
+            <w:pPr>
+              <w:spacing w:before="0" w:after="0"/>
+            </w:pPr>
+            <w:r>
+              <w:rPr>
+                <w:b/>
+                <w:sz w:val="20"/>
+              </w:rPr>
+              <w:t>Limit</w:t>
+            </w:r>
+          </w:p>
+        </w:tc>
+        <w:tc>
+          <w:tcPr>
+            <w:tcW w:type="dxa" w:w="4630"/>
+            <w:shd w:val="clear" w:color="auto" w:fill="E6ECF4"/>
+          </w:tcPr>
+          <w:p>
+            <w:pPr>
+              <w:spacing w:before="0" w:after="0"/>
+            </w:pPr>
+            <w:r>
+              <w:rPr>
+                <w:b/>
+                <w:sz w:val="20"/>
+              </w:rPr>
+              <w:t>What the evidence says</w:t>
+            </w:r>
+          </w:p>
+        </w:tc>
+        <w:tc>
+          <w:tcPr>
+            <w:tcW w:type="dxa" w:w="3334"/>
+            <w:shd w:val="clear" w:color="auto" w:fill="E6ECF4"/>
+          </w:tcPr>
+          <w:p>
+            <w:pPr>
+              <w:spacing w:before="0" w:after="0"/>
+            </w:pPr>
+            <w:r>
+              <w:rPr>
+                <w:b/>
+                <w:sz w:val="20"/>
+              </w:rPr>
+              <w:t>What it means for a screen</w:t>
+            </w:r>
+          </w:p>
+        </w:tc>
+      </w:tr>
+      <w:tr>
+        <w:trPr>
+          <w:cantSplit/>
+        </w:trPr>
+        <w:tc>
+          <w:tcPr>
+            <w:tcW w:type="dxa" w:w="1674"/>
+          </w:tcPr>
+          <w:p>
+            <w:pPr>
+              <w:spacing w:before="0" w:after="0"/>
+            </w:pPr>
+            <w:r>
+              <w:rPr>
+                <w:sz w:val="20"/>
+              </w:rPr>
+              <w:t>Speed and accuracy</w:t>
+            </w:r>
+          </w:p>
+        </w:tc>
+        <w:tc>
+          <w:tcPr>
+            <w:tcW w:type="dxa" w:w="4630"/>
+          </w:tcPr>
+          <w:p>
+            <w:pPr>
+              <w:spacing w:before="0" w:after="0"/>
+            </w:pPr>
+            <w:r>
+              <w:rPr>
+                <w:sz w:val="20"/>
+              </w:rPr>
+              <w:t>In Fitts's experiments, people who aimed to be faster made more errors: speed and accuracy trade off against each other (Fitts 1954).</w:t>
+            </w:r>
+          </w:p>
+        </w:tc>
+        <w:tc>
+          <w:tcPr>
+            <w:tcW w:type="dxa" w:w="3334"/>
+          </w:tcPr>
+          <w:p>
+            <w:pPr>
+              <w:spacing w:before="0" w:after="0"/>
+            </w:pPr>
+            <w:r>
+              <w:rPr>
+                <w:sz w:val="20"/>
+              </w:rPr>
+              <w:t>A small target in a hurry produces errors; time pressure raises the demands on every law.</w:t>
+            </w:r>
+          </w:p>
+        </w:tc>
+      </w:tr>
+      <w:tr>
+        <w:trPr>
+          <w:cantSplit/>
+        </w:trPr>
+        <w:tc>
+          <w:tcPr>
+            <w:tcW w:type="dxa" w:w="1674"/>
+          </w:tcPr>
+          <w:p>
+            <w:pPr>
+              <w:spacing w:before="0" w:after="0"/>
+            </w:pPr>
+            <w:r>
+              <w:rPr>
+                <w:sz w:val="20"/>
+              </w:rPr>
+              <w:t>Load and errors</w:t>
+            </w:r>
+          </w:p>
+        </w:tc>
+        <w:tc>
+          <w:tcPr>
+            <w:tcW w:type="dxa" w:w="4630"/>
+          </w:tcPr>
+          <w:p>
+            <w:pPr>
+              <w:spacing w:before="0" w:after="0"/>
+            </w:pPr>
+            <w:r>
+              <w:rPr>
+                <w:sz w:val="20"/>
+              </w:rPr>
+              <w:t>Effort spent on the interface leaves less for the task, and the task suffers (Sweller 1988).</w:t>
+            </w:r>
+          </w:p>
+        </w:tc>
+        <w:tc>
+          <w:tcPr>
+            <w:tcW w:type="dxa" w:w="3334"/>
+          </w:tcPr>
+          <w:p>
+            <w:pPr>
+              <w:spacing w:before="0" w:after="0"/>
+            </w:pPr>
+            <w:r>
+              <w:rPr>
+                <w:sz w:val="20"/>
+              </w:rPr>
+              <w:t>Count the targets to hit, the options to weigh and the items to remember in one step.</w:t>
+            </w:r>
+          </w:p>
+        </w:tc>
+      </w:tr>
+      <w:tr>
+        <w:trPr>
+          <w:cantSplit/>
+        </w:trPr>
+        <w:tc>
+          <w:tcPr>
+            <w:tcW w:type="dxa" w:w="1674"/>
+          </w:tcPr>
+          <w:p>
+            <w:pPr>
+              <w:spacing w:before="0" w:after="0"/>
+            </w:pPr>
+            <w:r>
+              <w:rPr>
+                <w:sz w:val="20"/>
+              </w:rPr>
+              <w:t>Completion</w:t>
+            </w:r>
+          </w:p>
+        </w:tc>
+        <w:tc>
+          <w:tcPr>
+            <w:tcW w:type="dxa" w:w="4630"/>
+          </w:tcPr>
+          <w:p>
+            <w:pPr>
+              <w:spacing w:before="0" w:after="0"/>
+            </w:pPr>
+            <w:r>
+              <w:rPr>
+                <w:sz w:val="20"/>
+              </w:rPr>
+              <w:t>17% of the US online shoppers had abandoned an order in the past quarter because the checkout seemed too long or complicated (Baymard Institute 2024).</w:t>
+            </w:r>
+          </w:p>
+        </w:tc>
+        <w:tc>
+          <w:tcPr>
+            <w:tcW w:type="dxa" w:w="3334"/>
+          </w:tcPr>
+          <w:p>
+            <w:pPr>
+              <w:spacing w:before="0" w:after="0"/>
+            </w:pPr>
+            <w:r>
+              <w:rPr>
+                <w:sz w:val="20"/>
+              </w:rPr>
+              <w:t>The three limits meet in forms and checkouts: reduce them there first.</w:t>
+            </w:r>
+          </w:p>
+        </w:tc>
+      </w:tr>
+    </w:tbl>
+    <w:p>
+      <w:pPr>
+        <w:spacing w:before="0" w:after="80"/>
+      </w:pPr>
+    </w:p>
     <w:tbl>
       <w:tblPr>
         <w:tblW w:w="9598" w:type="dxa"/>
@@ -4970,7 +6169,7 @@
             </w:pPr>
             <w:r>
               <w:rPr/>
-              <w:t>Ticketo, Leon, Mara, Priya and Tobias are made up for this example. The three laws together follow Yablonski (2020); cognitive load follows Sweller (1988).</w:t>
+              <w:t>Ticketo, Leon, Mara, Priya and Tobias are made up for this example. The three laws together follow Yablonski (2020); cognitive load follows Sweller (1988). The findings in the table of real evidence are real research results, rules and cases; the sources are listed below.</w:t>
             </w:r>
           </w:p>
         </w:tc>
@@ -5149,7 +6348,7 @@
           <w:color w:val="556274"/>
           <w:sz w:val="18"/>
         </w:rPr>
-        <w:t>Yablonski 2020 · Fitts 1954 · Hick 1952 · Miller 1956 · Sweller 1988</w:t>
+        <w:t>Yablonski 2020 · Fitts 1954 · Hick 1952 · Miller 1956 · Sweller 1988 · Baymard Institute 2024</w:t>
       </w:r>
     </w:p>
     <w:p>
@@ -5263,7 +6462,7 @@
             </w:r>
             <w:r>
               <w:rPr/>
-              <w:t xml:space="preserve"> Three measures Ticketo considered, rated on effect on users, feasibility, risk and time pressure. A rating is a reading of the example, not a mark.</w:t>
+              <w:t xml:space="preserve"> Three measures Ticketo considered, rated on effect on users, feasibility, risk and time pressure. A rating is a reading of the example, not a mark. A table of the aims and their evidence follows.</w:t>
             </w:r>
           </w:p>
         </w:tc>
@@ -5329,6 +6528,266 @@
         <w:t>Figure 5 · Ticketo weighs three measures on effect on users, feasibility, risk and time pressure.</w:t>
       </w:r>
     </w:p>
+    <w:p>
+      <w:pPr>
+        <w:spacing w:before="0" w:after="100"/>
+      </w:pPr>
+      <w:r>
+        <w:rPr>
+          <w:b/>
+        </w:rPr>
+        <w:t>Less searching, fewer errors, less decision stress</w:t>
+      </w:r>
+    </w:p>
+    <w:tbl>
+      <w:tblPr>
+        <w:tblW w:w="9638" w:type="dxa"/>
+        <w:tblBorders>
+          <w:top w:val="single" w:sz="4" w:space="0" w:color="D5DEE9"/>
+          <w:left w:val="single" w:sz="4" w:space="0" w:color="D5DEE9"/>
+          <w:bottom w:val="single" w:sz="4" w:space="0" w:color="D5DEE9"/>
+          <w:right w:val="single" w:sz="4" w:space="0" w:color="D5DEE9"/>
+          <w:insideH w:val="single" w:sz="4" w:space="0" w:color="D5DEE9"/>
+          <w:insideV w:val="single" w:sz="4" w:space="0" w:color="D5DEE9"/>
+        </w:tblBorders>
+        <w:tblLayout w:type="fixed"/>
+        <w:tblCellMar>
+          <w:top w:w="60" w:type="dxa"/>
+          <w:left w:w="100" w:type="dxa"/>
+          <w:bottom w:w="60" w:type="dxa"/>
+          <w:right w:w="100" w:type="dxa"/>
+        </w:tblCellMar>
+      </w:tblPr>
+      <w:tblGrid>
+        <w:gridCol w:w="1605"/>
+        <w:gridCol w:w="4556"/>
+        <w:gridCol w:w="3477"/>
+      </w:tblGrid>
+      <w:tr>
+        <w:trPr>
+          <w:cantSplit/>
+          <w:tblHeader/>
+        </w:trPr>
+        <w:tc>
+          <w:tcPr>
+            <w:tcW w:type="dxa" w:w="1605"/>
+            <w:shd w:val="clear" w:color="auto" w:fill="E6ECF4"/>
+          </w:tcPr>
+          <w:p>
+            <w:pPr>
+              <w:spacing w:before="0" w:after="0"/>
+            </w:pPr>
+            <w:r>
+              <w:rPr>
+                <w:b/>
+                <w:sz w:val="20"/>
+              </w:rPr>
+              <w:t>Aim</w:t>
+            </w:r>
+          </w:p>
+        </w:tc>
+        <w:tc>
+          <w:tcPr>
+            <w:tcW w:type="dxa" w:w="4556"/>
+            <w:shd w:val="clear" w:color="auto" w:fill="E6ECF4"/>
+          </w:tcPr>
+          <w:p>
+            <w:pPr>
+              <w:spacing w:before="0" w:after="0"/>
+            </w:pPr>
+            <w:r>
+              <w:rPr>
+                <w:b/>
+                <w:sz w:val="20"/>
+              </w:rPr>
+              <w:t>Real finding or rule</w:t>
+            </w:r>
+          </w:p>
+        </w:tc>
+        <w:tc>
+          <w:tcPr>
+            <w:tcW w:type="dxa" w:w="3477"/>
+            <w:shd w:val="clear" w:color="auto" w:fill="E6ECF4"/>
+          </w:tcPr>
+          <w:p>
+            <w:pPr>
+              <w:spacing w:before="0" w:after="0"/>
+            </w:pPr>
+            <w:r>
+              <w:rPr>
+                <w:b/>
+                <w:sz w:val="20"/>
+              </w:rPr>
+              <w:t>What it means for a measure</w:t>
+            </w:r>
+          </w:p>
+        </w:tc>
+      </w:tr>
+      <w:tr>
+        <w:trPr>
+          <w:cantSplit/>
+        </w:trPr>
+        <w:tc>
+          <w:tcPr>
+            <w:tcW w:type="dxa" w:w="1605"/>
+          </w:tcPr>
+          <w:p>
+            <w:pPr>
+              <w:spacing w:before="0" w:after="0"/>
+            </w:pPr>
+            <w:r>
+              <w:rPr>
+                <w:sz w:val="20"/>
+              </w:rPr>
+              <w:t>Less searching</w:t>
+            </w:r>
+          </w:p>
+        </w:tc>
+        <w:tc>
+          <w:tcPr>
+            <w:tcW w:type="dxa" w:w="4556"/>
+          </w:tcPr>
+          <w:p>
+            <w:pPr>
+              <w:spacing w:before="0" w:after="0"/>
+            </w:pPr>
+            <w:r>
+              <w:rPr>
+                <w:sz w:val="20"/>
+              </w:rPr>
+              <w:t>Recognition rather than recall is one of the ten heuristics (Nielsen 1994); recognition memory for pictures showed no sign of saturation after 10,000 pictures (Standing 1973).</w:t>
+            </w:r>
+          </w:p>
+        </w:tc>
+        <w:tc>
+          <w:tcPr>
+            <w:tcW w:type="dxa" w:w="3477"/>
+          </w:tcPr>
+          <w:p>
+            <w:pPr>
+              <w:spacing w:before="0" w:after="0"/>
+            </w:pPr>
+            <w:r>
+              <w:rPr>
+                <w:sz w:val="20"/>
+              </w:rPr>
+              <w:t>Show the option and its words instead of asking people to remember them.</w:t>
+            </w:r>
+          </w:p>
+        </w:tc>
+      </w:tr>
+      <w:tr>
+        <w:trPr>
+          <w:cantSplit/>
+        </w:trPr>
+        <w:tc>
+          <w:tcPr>
+            <w:tcW w:type="dxa" w:w="1605"/>
+          </w:tcPr>
+          <w:p>
+            <w:pPr>
+              <w:spacing w:before="0" w:after="0"/>
+            </w:pPr>
+            <w:r>
+              <w:rPr>
+                <w:sz w:val="20"/>
+              </w:rPr>
+              <w:t>Fewer errors</w:t>
+            </w:r>
+          </w:p>
+        </w:tc>
+        <w:tc>
+          <w:tcPr>
+            <w:tcW w:type="dxa" w:w="4556"/>
+          </w:tcPr>
+          <w:p>
+            <w:pPr>
+              <w:spacing w:before="0" w:after="0"/>
+            </w:pPr>
+            <w:r>
+              <w:rPr>
+                <w:sz w:val="20"/>
+              </w:rPr>
+              <w:t>Error prevention is another of the ten heuristics (Nielsen 1994): design so that the wrong action is hard to take.</w:t>
+            </w:r>
+          </w:p>
+        </w:tc>
+        <w:tc>
+          <w:tcPr>
+            <w:tcW w:type="dxa" w:w="3477"/>
+          </w:tcPr>
+          <w:p>
+            <w:pPr>
+              <w:spacing w:before="0" w:after="0"/>
+            </w:pPr>
+            <w:r>
+              <w:rPr>
+                <w:sz w:val="20"/>
+              </w:rPr>
+              <w:t>Space the targets, separate the destructive action and confirm only what cannot be undone.</w:t>
+            </w:r>
+          </w:p>
+        </w:tc>
+      </w:tr>
+      <w:tr>
+        <w:trPr>
+          <w:cantSplit/>
+        </w:trPr>
+        <w:tc>
+          <w:tcPr>
+            <w:tcW w:type="dxa" w:w="1605"/>
+          </w:tcPr>
+          <w:p>
+            <w:pPr>
+              <w:spacing w:before="0" w:after="0"/>
+            </w:pPr>
+            <w:r>
+              <w:rPr>
+                <w:sz w:val="20"/>
+              </w:rPr>
+              <w:t>Less decision stress</w:t>
+            </w:r>
+          </w:p>
+        </w:tc>
+        <w:tc>
+          <w:tcPr>
+            <w:tcW w:type="dxa" w:w="4556"/>
+          </w:tcPr>
+          <w:p>
+            <w:pPr>
+              <w:spacing w:before="0" w:after="0"/>
+            </w:pPr>
+            <w:r>
+              <w:rPr>
+                <w:sz w:val="20"/>
+              </w:rPr>
+              <w:t>More choice drew more interest and fewer purchases (Iyengar and Lepper 2000).</w:t>
+            </w:r>
+          </w:p>
+        </w:tc>
+        <w:tc>
+          <w:tcPr>
+            <w:tcW w:type="dxa" w:w="3477"/>
+          </w:tcPr>
+          <w:p>
+            <w:pPr>
+              <w:spacing w:before="0" w:after="0"/>
+            </w:pPr>
+            <w:r>
+              <w:rPr>
+                <w:sz w:val="20"/>
+              </w:rPr>
+              <w:t>Recommend one path and put the alternatives in a secondary place.</w:t>
+            </w:r>
+          </w:p>
+        </w:tc>
+      </w:tr>
+    </w:tbl>
+    <w:p>
+      <w:pPr>
+        <w:spacing w:before="0" w:after="80"/>
+      </w:pPr>
+    </w:p>
     <w:tbl>
       <w:tblPr>
         <w:tblW w:w="9598" w:type="dxa"/>
@@ -5378,7 +6837,7 @@
             </w:pPr>
             <w:r>
               <w:rPr/>
-              <w:t>Ticketo, Leon, Mara, Priya and Tobias are made up for this example. The laws as practical tools follow Yablonski (2020); rating options on the same criteria with a reason follows Gibbons (2018). The four criteria are the ones the plan names for the case study.</w:t>
+              <w:t>Ticketo, Leon, Mara, Priya and Tobias are made up for this example. The laws as practical tools follow Yablonski (2020); rating options on the same criteria with a reason follows Gibbons (2018). The four criteria are the ones the plan names for the case study. The findings in the table of real evidence are real research results, rules and cases; the sources are listed below.</w:t>
             </w:r>
           </w:p>
         </w:tc>
@@ -5567,7 +7026,7 @@
           <w:color w:val="556274"/>
           <w:sz w:val="18"/>
         </w:rPr>
-        <w:t>Yablonski 2020 · Gibbons 2018 · WCAG 2.2</w:t>
+        <w:t>Yablonski 2020 · Gibbons 2018 · WCAG 2.2 · Standing 1973 · Nielsen 1994 · Iyengar &amp; Lepper 2000</w:t>
       </w:r>
     </w:p>
     <w:p>
@@ -5753,7 +7212,7 @@
             </w:r>
             <w:r>
               <w:rPr/>
-              <w:t xml:space="preserve"> Left Ticketo fixing details one screen at a time, right deciding interaction standards once. Below, the chain from a button to the business.</w:t>
+              <w:t xml:space="preserve"> Left Ticketo fixing details one screen at a time, right deciding interaction standards once. Below, the chain from a button to the business. A table of examples of standards follows.</w:t>
             </w:r>
           </w:p>
         </w:tc>
@@ -5874,6 +7333,266 @@
         <w:t>Figure 7 · From a button to the business.</w:t>
       </w:r>
     </w:p>
+    <w:p>
+      <w:pPr>
+        <w:spacing w:before="0" w:after="100"/>
+      </w:pPr>
+      <w:r>
+        <w:rPr>
+          <w:b/>
+        </w:rPr>
+        <w:t>Interaction standards as architecture: examples</w:t>
+      </w:r>
+    </w:p>
+    <w:tbl>
+      <w:tblPr>
+        <w:tblW w:w="9638" w:type="dxa"/>
+        <w:tblBorders>
+          <w:top w:val="single" w:sz="4" w:space="0" w:color="D5DEE9"/>
+          <w:left w:val="single" w:sz="4" w:space="0" w:color="D5DEE9"/>
+          <w:bottom w:val="single" w:sz="4" w:space="0" w:color="D5DEE9"/>
+          <w:right w:val="single" w:sz="4" w:space="0" w:color="D5DEE9"/>
+          <w:insideH w:val="single" w:sz="4" w:space="0" w:color="D5DEE9"/>
+          <w:insideV w:val="single" w:sz="4" w:space="0" w:color="D5DEE9"/>
+        </w:tblBorders>
+        <w:tblLayout w:type="fixed"/>
+        <w:tblCellMar>
+          <w:top w:w="60" w:type="dxa"/>
+          <w:left w:w="100" w:type="dxa"/>
+          <w:bottom w:w="60" w:type="dxa"/>
+          <w:right w:w="100" w:type="dxa"/>
+        </w:tblCellMar>
+      </w:tblPr>
+      <w:tblGrid>
+        <w:gridCol w:w="2010"/>
+        <w:gridCol w:w="4128"/>
+        <w:gridCol w:w="3500"/>
+      </w:tblGrid>
+      <w:tr>
+        <w:trPr>
+          <w:cantSplit/>
+          <w:tblHeader/>
+        </w:trPr>
+        <w:tc>
+          <w:tcPr>
+            <w:tcW w:type="dxa" w:w="2010"/>
+            <w:shd w:val="clear" w:color="auto" w:fill="E6ECF4"/>
+          </w:tcPr>
+          <w:p>
+            <w:pPr>
+              <w:spacing w:before="0" w:after="0"/>
+            </w:pPr>
+            <w:r>
+              <w:rPr>
+                <w:b/>
+                <w:sz w:val="20"/>
+              </w:rPr>
+              <w:t>Standard</w:t>
+            </w:r>
+          </w:p>
+        </w:tc>
+        <w:tc>
+          <w:tcPr>
+            <w:tcW w:type="dxa" w:w="4128"/>
+            <w:shd w:val="clear" w:color="auto" w:fill="E6ECF4"/>
+          </w:tcPr>
+          <w:p>
+            <w:pPr>
+              <w:spacing w:before="0" w:after="0"/>
+            </w:pPr>
+            <w:r>
+              <w:rPr>
+                <w:b/>
+                <w:sz w:val="20"/>
+              </w:rPr>
+              <w:t>Real example</w:t>
+            </w:r>
+          </w:p>
+        </w:tc>
+        <w:tc>
+          <w:tcPr>
+            <w:tcW w:type="dxa" w:w="3500"/>
+            <w:shd w:val="clear" w:color="auto" w:fill="E6ECF4"/>
+          </w:tcPr>
+          <w:p>
+            <w:pPr>
+              <w:spacing w:before="0" w:after="0"/>
+            </w:pPr>
+            <w:r>
+              <w:rPr>
+                <w:b/>
+                <w:sz w:val="20"/>
+              </w:rPr>
+              <w:t>What it means</w:t>
+            </w:r>
+          </w:p>
+        </w:tc>
+      </w:tr>
+      <w:tr>
+        <w:trPr>
+          <w:cantSplit/>
+        </w:trPr>
+        <w:tc>
+          <w:tcPr>
+            <w:tcW w:type="dxa" w:w="2010"/>
+          </w:tcPr>
+          <w:p>
+            <w:pPr>
+              <w:spacing w:before="0" w:after="0"/>
+            </w:pPr>
+            <w:r>
+              <w:rPr>
+                <w:sz w:val="20"/>
+              </w:rPr>
+              <w:t>A floor for targets</w:t>
+            </w:r>
+          </w:p>
+        </w:tc>
+        <w:tc>
+          <w:tcPr>
+            <w:tcW w:type="dxa" w:w="4128"/>
+          </w:tcPr>
+          <w:p>
+            <w:pPr>
+              <w:spacing w:before="0" w:after="0"/>
+            </w:pPr>
+            <w:r>
+              <w:rPr>
+                <w:sz w:val="20"/>
+              </w:rPr>
+              <w:t>WCAG 2.2 sets 24 CSS pixels as the minimum target size at level AA and 44 at level AAA.</w:t>
+            </w:r>
+          </w:p>
+        </w:tc>
+        <w:tc>
+          <w:tcPr>
+            <w:tcW w:type="dxa" w:w="3500"/>
+          </w:tcPr>
+          <w:p>
+            <w:pPr>
+              <w:spacing w:before="0" w:after="0"/>
+            </w:pPr>
+            <w:r>
+              <w:rPr>
+                <w:sz w:val="20"/>
+              </w:rPr>
+              <w:t>A size is a rule that every team meets, not a detail per screen.</w:t>
+            </w:r>
+          </w:p>
+        </w:tc>
+      </w:tr>
+      <w:tr>
+        <w:trPr>
+          <w:cantSplit/>
+        </w:trPr>
+        <w:tc>
+          <w:tcPr>
+            <w:tcW w:type="dxa" w:w="2010"/>
+          </w:tcPr>
+          <w:p>
+            <w:pPr>
+              <w:spacing w:before="0" w:after="0"/>
+            </w:pPr>
+            <w:r>
+              <w:rPr>
+                <w:sz w:val="20"/>
+              </w:rPr>
+              <w:t>Rules and components</w:t>
+            </w:r>
+          </w:p>
+        </w:tc>
+        <w:tc>
+          <w:tcPr>
+            <w:tcW w:type="dxa" w:w="4128"/>
+          </w:tcPr>
+          <w:p>
+            <w:pPr>
+              <w:spacing w:before="0" w:after="0"/>
+            </w:pPr>
+            <w:r>
+              <w:rPr>
+                <w:sz w:val="20"/>
+              </w:rPr>
+              <w:t>Interfaces built from shared rules and components stay consistent (Frost 2016).</w:t>
+            </w:r>
+          </w:p>
+        </w:tc>
+        <w:tc>
+          <w:tcPr>
+            <w:tcW w:type="dxa" w:w="3500"/>
+          </w:tcPr>
+          <w:p>
+            <w:pPr>
+              <w:spacing w:before="0" w:after="0"/>
+            </w:pPr>
+            <w:r>
+              <w:rPr>
+                <w:sz w:val="20"/>
+              </w:rPr>
+              <w:t>Write the standard once, in the components.</w:t>
+            </w:r>
+          </w:p>
+        </w:tc>
+      </w:tr>
+      <w:tr>
+        <w:trPr>
+          <w:cantSplit/>
+        </w:trPr>
+        <w:tc>
+          <w:tcPr>
+            <w:tcW w:type="dxa" w:w="2010"/>
+          </w:tcPr>
+          <w:p>
+            <w:pPr>
+              <w:spacing w:before="0" w:after="0"/>
+            </w:pPr>
+            <w:r>
+              <w:rPr>
+                <w:sz w:val="20"/>
+              </w:rPr>
+              <w:t>The laws as a toolkit</w:t>
+            </w:r>
+          </w:p>
+        </w:tc>
+        <w:tc>
+          <w:tcPr>
+            <w:tcW w:type="dxa" w:w="4128"/>
+          </w:tcPr>
+          <w:p>
+            <w:pPr>
+              <w:spacing w:before="0" w:after="0"/>
+            </w:pPr>
+            <w:r>
+              <w:rPr>
+                <w:sz w:val="20"/>
+              </w:rPr>
+              <w:t>Laws of UX collects the laws, with examples and their limits (Yablonski 2020).</w:t>
+            </w:r>
+          </w:p>
+        </w:tc>
+        <w:tc>
+          <w:tcPr>
+            <w:tcW w:type="dxa" w:w="3500"/>
+          </w:tcPr>
+          <w:p>
+            <w:pPr>
+              <w:spacing w:before="0" w:after="0"/>
+            </w:pPr>
+            <w:r>
+              <w:rPr>
+                <w:sz w:val="20"/>
+              </w:rPr>
+              <w:t>Use the laws as a common language between design, product and management.</w:t>
+            </w:r>
+          </w:p>
+        </w:tc>
+      </w:tr>
+    </w:tbl>
+    <w:p>
+      <w:pPr>
+        <w:spacing w:before="0" w:after="80"/>
+      </w:pPr>
+    </w:p>
     <w:tbl>
       <w:tblPr>
         <w:tblW w:w="9598" w:type="dxa"/>
@@ -5923,7 +7642,7 @@
             </w:pPr>
             <w:r>
               <w:rPr/>
-              <w:t>Ticketo, Leon, Mara, Priya and Tobias are made up for this example. Building interfaces from shared rules and components follows Frost (2016); the target size floor follows WCAG 2.2.</w:t>
+              <w:t>Ticketo, Leon, Mara, Priya and Tobias are made up for this example. Building interfaces from shared rules and components follows Frost (2016); the target size floor follows WCAG 2.2. The findings in the table of real evidence are real research results, rules and cases; the sources are listed below.</w:t>
             </w:r>
           </w:p>
         </w:tc>
@@ -6216,7 +7935,7 @@
             </w:r>
             <w:r>
               <w:rPr/>
-              <w:t xml:space="preserve"> The matrix places five Ticketo designs by how many options they show at once (to the right) and how fast and safely people finish (upwards). A position is a reading of the example, not a score.</w:t>
+              <w:t xml:space="preserve"> The matrix places five Ticketo designs by how many options they show at once (to the right) and how fast and safely people finish (upwards). A position is a reading of the example, not a score. A table of conflicts with evidence follows.</w:t>
             </w:r>
           </w:p>
         </w:tc>
@@ -6542,6 +8261,266 @@
         <w:spacing w:before="0" w:after="80"/>
       </w:pPr>
     </w:p>
+    <w:p>
+      <w:pPr>
+        <w:spacing w:before="0" w:after="100"/>
+      </w:pPr>
+      <w:r>
+        <w:rPr>
+          <w:b/>
+        </w:rPr>
+        <w:t>Conflicts of efficient interaction, with evidence</w:t>
+      </w:r>
+    </w:p>
+    <w:tbl>
+      <w:tblPr>
+        <w:tblW w:w="9638" w:type="dxa"/>
+        <w:tblBorders>
+          <w:top w:val="single" w:sz="4" w:space="0" w:color="D5DEE9"/>
+          <w:left w:val="single" w:sz="4" w:space="0" w:color="D5DEE9"/>
+          <w:bottom w:val="single" w:sz="4" w:space="0" w:color="D5DEE9"/>
+          <w:right w:val="single" w:sz="4" w:space="0" w:color="D5DEE9"/>
+          <w:insideH w:val="single" w:sz="4" w:space="0" w:color="D5DEE9"/>
+          <w:insideV w:val="single" w:sz="4" w:space="0" w:color="D5DEE9"/>
+        </w:tblBorders>
+        <w:tblLayout w:type="fixed"/>
+        <w:tblCellMar>
+          <w:top w:w="60" w:type="dxa"/>
+          <w:left w:w="100" w:type="dxa"/>
+          <w:bottom w:w="60" w:type="dxa"/>
+          <w:right w:w="100" w:type="dxa"/>
+        </w:tblCellMar>
+      </w:tblPr>
+      <w:tblGrid>
+        <w:gridCol w:w="2255"/>
+        <w:gridCol w:w="4566"/>
+        <w:gridCol w:w="2817"/>
+      </w:tblGrid>
+      <w:tr>
+        <w:trPr>
+          <w:cantSplit/>
+          <w:tblHeader/>
+        </w:trPr>
+        <w:tc>
+          <w:tcPr>
+            <w:tcW w:type="dxa" w:w="2255"/>
+            <w:shd w:val="clear" w:color="auto" w:fill="E6ECF4"/>
+          </w:tcPr>
+          <w:p>
+            <w:pPr>
+              <w:spacing w:before="0" w:after="0"/>
+            </w:pPr>
+            <w:r>
+              <w:rPr>
+                <w:b/>
+                <w:sz w:val="20"/>
+              </w:rPr>
+              <w:t>Conflict</w:t>
+            </w:r>
+          </w:p>
+        </w:tc>
+        <w:tc>
+          <w:tcPr>
+            <w:tcW w:type="dxa" w:w="4566"/>
+            <w:shd w:val="clear" w:color="auto" w:fill="E6ECF4"/>
+          </w:tcPr>
+          <w:p>
+            <w:pPr>
+              <w:spacing w:before="0" w:after="0"/>
+            </w:pPr>
+            <w:r>
+              <w:rPr>
+                <w:b/>
+                <w:sz w:val="20"/>
+              </w:rPr>
+              <w:t>What the evidence says</w:t>
+            </w:r>
+          </w:p>
+        </w:tc>
+        <w:tc>
+          <w:tcPr>
+            <w:tcW w:type="dxa" w:w="2817"/>
+            <w:shd w:val="clear" w:color="auto" w:fill="E6ECF4"/>
+          </w:tcPr>
+          <w:p>
+            <w:pPr>
+              <w:spacing w:before="0" w:after="0"/>
+            </w:pPr>
+            <w:r>
+              <w:rPr>
+                <w:b/>
+                <w:sz w:val="20"/>
+              </w:rPr>
+              <w:t>A way to decide</w:t>
+            </w:r>
+          </w:p>
+        </w:tc>
+      </w:tr>
+      <w:tr>
+        <w:trPr>
+          <w:cantSplit/>
+        </w:trPr>
+        <w:tc>
+          <w:tcPr>
+            <w:tcW w:type="dxa" w:w="2255"/>
+          </w:tcPr>
+          <w:p>
+            <w:pPr>
+              <w:spacing w:before="0" w:after="0"/>
+            </w:pPr>
+            <w:r>
+              <w:rPr>
+                <w:sz w:val="20"/>
+              </w:rPr>
+              <w:t>Feature richness against speed</w:t>
+            </w:r>
+          </w:p>
+        </w:tc>
+        <w:tc>
+          <w:tcPr>
+            <w:tcW w:type="dxa" w:w="4566"/>
+          </w:tcPr>
+          <w:p>
+            <w:pPr>
+              <w:spacing w:before="0" w:after="0"/>
+            </w:pPr>
+            <w:r>
+              <w:rPr>
+                <w:sz w:val="20"/>
+              </w:rPr>
+              <w:t>Fewer options can mean more decisions (Iyengar and Lepper 2000), and a medium structure beats the broadest one (Larson and Czerwinski 1998).</w:t>
+            </w:r>
+          </w:p>
+        </w:tc>
+        <w:tc>
+          <w:tcPr>
+            <w:tcW w:type="dxa" w:w="2817"/>
+          </w:tcPr>
+          <w:p>
+            <w:pPr>
+              <w:spacing w:before="0" w:after="0"/>
+            </w:pPr>
+            <w:r>
+              <w:rPr>
+                <w:sz w:val="20"/>
+              </w:rPr>
+              <w:t>Put the actions most users need most often first.</w:t>
+            </w:r>
+          </w:p>
+        </w:tc>
+      </w:tr>
+      <w:tr>
+        <w:trPr>
+          <w:cantSplit/>
+        </w:trPr>
+        <w:tc>
+          <w:tcPr>
+            <w:tcW w:type="dxa" w:w="2255"/>
+          </w:tcPr>
+          <w:p>
+            <w:pPr>
+              <w:spacing w:before="0" w:after="0"/>
+            </w:pPr>
+            <w:r>
+              <w:rPr>
+                <w:sz w:val="20"/>
+              </w:rPr>
+              <w:t>Reduction against steps</w:t>
+            </w:r>
+          </w:p>
+        </w:tc>
+        <w:tc>
+          <w:tcPr>
+            <w:tcW w:type="dxa" w:w="4566"/>
+          </w:tcPr>
+          <w:p>
+            <w:pPr>
+              <w:spacing w:before="0" w:after="0"/>
+            </w:pPr>
+            <w:r>
+              <w:rPr>
+                <w:sz w:val="20"/>
+              </w:rPr>
+              <w:t>More than two levels of progressive disclosure usually lowers usability (Nielsen 2006).</w:t>
+            </w:r>
+          </w:p>
+        </w:tc>
+        <w:tc>
+          <w:tcPr>
+            <w:tcW w:type="dxa" w:w="2817"/>
+          </w:tcPr>
+          <w:p>
+            <w:pPr>
+              <w:spacing w:before="0" w:after="0"/>
+            </w:pPr>
+            <w:r>
+              <w:rPr>
+                <w:sz w:val="20"/>
+              </w:rPr>
+              <w:t>Count the steps of the frequent task before and after the reduction.</w:t>
+            </w:r>
+          </w:p>
+        </w:tc>
+      </w:tr>
+      <w:tr>
+        <w:trPr>
+          <w:cantSplit/>
+        </w:trPr>
+        <w:tc>
+          <w:tcPr>
+            <w:tcW w:type="dxa" w:w="2255"/>
+          </w:tcPr>
+          <w:p>
+            <w:pPr>
+              <w:spacing w:before="0" w:after="0"/>
+            </w:pPr>
+            <w:r>
+              <w:rPr>
+                <w:sz w:val="20"/>
+              </w:rPr>
+              <w:t>A minimal look against reachability</w:t>
+            </w:r>
+          </w:p>
+        </w:tc>
+        <w:tc>
+          <w:tcPr>
+            <w:tcW w:type="dxa" w:w="4566"/>
+          </w:tcPr>
+          <w:p>
+            <w:pPr>
+              <w:spacing w:before="0" w:after="0"/>
+            </w:pPr>
+            <w:r>
+              <w:rPr>
+                <w:sz w:val="20"/>
+              </w:rPr>
+              <w:t>One-handed use is the most common grip in one observation (Hoober 2013, as reported), and 9.2 mm was the size found enough for thumb use (Parhi et al. 2006).</w:t>
+            </w:r>
+          </w:p>
+        </w:tc>
+        <w:tc>
+          <w:tcPr>
+            <w:tcW w:type="dxa" w:w="2817"/>
+          </w:tcPr>
+          <w:p>
+            <w:pPr>
+              <w:spacing w:before="0" w:after="0"/>
+            </w:pPr>
+            <w:r>
+              <w:rPr>
+                <w:sz w:val="20"/>
+              </w:rPr>
+              <w:t>Keep the main targets large and in reach, whatever the brand look.</w:t>
+            </w:r>
+          </w:p>
+        </w:tc>
+      </w:tr>
+    </w:tbl>
+    <w:p>
+      <w:pPr>
+        <w:spacing w:before="0" w:after="80"/>
+      </w:pPr>
+    </w:p>
     <w:tbl>
       <w:tblPr>
         <w:tblW w:w="9598" w:type="dxa"/>
@@ -6591,7 +8570,7 @@
             </w:pPr>
             <w:r>
               <w:rPr/>
-              <w:t>Ticketo, Leon, Mara, Priya and Tobias are made up for this example. Many options making people choose less follows Iyengar and Lepper (2000); progressive disclosure follows Nielsen (2006); the matrix is a reading of the example, not a score.</w:t>
+              <w:t>Ticketo, Leon, Mara, Priya and Tobias are made up for this example. Many options making people choose less follows Iyengar and Lepper (2000); progressive disclosure follows Nielsen (2006); the matrix is a reading of the example, not a score. The findings in the table of real evidence are real research results, rules and cases; the sources are listed below.</w:t>
             </w:r>
           </w:p>
         </w:tc>
@@ -6780,7 +8759,7 @@
           <w:color w:val="556274"/>
           <w:sz w:val="18"/>
         </w:rPr>
-        <w:t>Iyengar &amp; Lepper 2000 · Gibbons 2018 · Nielsen 2006</w:t>
+        <w:t>Iyengar &amp; Lepper 2000 · Gibbons 2018 · Nielsen 2006 · Larson &amp; Czerwinski 1998 · Hoober 2013 · Parhi et al. 2006</w:t>
       </w:r>
     </w:p>
     <w:p>
@@ -6894,7 +8873,7 @@
             </w:r>
             <w:r>
               <w:rPr/>
-              <w:t xml:space="preserve"> The four boxes at the top are the parts of a decision, filled in for Ticketo. The two boxes below are the rule for future decisions.</w:t>
+              <w:t xml:space="preserve"> The four boxes at the top are the parts of a decision, filled in for Ticketo. The two boxes below are the rule for future decisions. A table of rules and evidence follows.</w:t>
             </w:r>
           </w:p>
         </w:tc>
@@ -7220,6 +9199,266 @@
         <w:spacing w:before="0" w:after="80"/>
       </w:pPr>
     </w:p>
+    <w:p>
+      <w:pPr>
+        <w:spacing w:before="0" w:after="100"/>
+      </w:pPr>
+      <w:r>
+        <w:rPr>
+          <w:b/>
+        </w:rPr>
+        <w:t>Owning interaction standards: rules and evidence</w:t>
+      </w:r>
+    </w:p>
+    <w:tbl>
+      <w:tblPr>
+        <w:tblW w:w="9638" w:type="dxa"/>
+        <w:tblBorders>
+          <w:top w:val="single" w:sz="4" w:space="0" w:color="D5DEE9"/>
+          <w:left w:val="single" w:sz="4" w:space="0" w:color="D5DEE9"/>
+          <w:bottom w:val="single" w:sz="4" w:space="0" w:color="D5DEE9"/>
+          <w:right w:val="single" w:sz="4" w:space="0" w:color="D5DEE9"/>
+          <w:insideH w:val="single" w:sz="4" w:space="0" w:color="D5DEE9"/>
+          <w:insideV w:val="single" w:sz="4" w:space="0" w:color="D5DEE9"/>
+        </w:tblBorders>
+        <w:tblLayout w:type="fixed"/>
+        <w:tblCellMar>
+          <w:top w:w="60" w:type="dxa"/>
+          <w:left w:w="100" w:type="dxa"/>
+          <w:bottom w:w="60" w:type="dxa"/>
+          <w:right w:w="100" w:type="dxa"/>
+        </w:tblCellMar>
+      </w:tblPr>
+      <w:tblGrid>
+        <w:gridCol w:w="1863"/>
+        <w:gridCol w:w="4764"/>
+        <w:gridCol w:w="3011"/>
+      </w:tblGrid>
+      <w:tr>
+        <w:trPr>
+          <w:cantSplit/>
+          <w:tblHeader/>
+        </w:trPr>
+        <w:tc>
+          <w:tcPr>
+            <w:tcW w:type="dxa" w:w="1863"/>
+            <w:shd w:val="clear" w:color="auto" w:fill="E6ECF4"/>
+          </w:tcPr>
+          <w:p>
+            <w:pPr>
+              <w:spacing w:before="0" w:after="0"/>
+            </w:pPr>
+            <w:r>
+              <w:rPr>
+                <w:b/>
+                <w:sz w:val="20"/>
+              </w:rPr>
+              <w:t>Part</w:t>
+            </w:r>
+          </w:p>
+        </w:tc>
+        <w:tc>
+          <w:tcPr>
+            <w:tcW w:type="dxa" w:w="4764"/>
+            <w:shd w:val="clear" w:color="auto" w:fill="E6ECF4"/>
+          </w:tcPr>
+          <w:p>
+            <w:pPr>
+              <w:spacing w:before="0" w:after="0"/>
+            </w:pPr>
+            <w:r>
+              <w:rPr>
+                <w:b/>
+                <w:sz w:val="20"/>
+              </w:rPr>
+              <w:t>Evidence or rule</w:t>
+            </w:r>
+          </w:p>
+        </w:tc>
+        <w:tc>
+          <w:tcPr>
+            <w:tcW w:type="dxa" w:w="3011"/>
+            <w:shd w:val="clear" w:color="auto" w:fill="E6ECF4"/>
+          </w:tcPr>
+          <w:p>
+            <w:pPr>
+              <w:spacing w:before="0" w:after="0"/>
+            </w:pPr>
+            <w:r>
+              <w:rPr>
+                <w:b/>
+                <w:sz w:val="20"/>
+              </w:rPr>
+              <w:t>What it means</w:t>
+            </w:r>
+          </w:p>
+        </w:tc>
+      </w:tr>
+      <w:tr>
+        <w:trPr>
+          <w:cantSplit/>
+        </w:trPr>
+        <w:tc>
+          <w:tcPr>
+            <w:tcW w:type="dxa" w:w="1863"/>
+          </w:tcPr>
+          <w:p>
+            <w:pPr>
+              <w:spacing w:before="0" w:after="0"/>
+            </w:pPr>
+            <w:r>
+              <w:rPr>
+                <w:sz w:val="20"/>
+              </w:rPr>
+              <w:t>Who owns what</w:t>
+            </w:r>
+          </w:p>
+        </w:tc>
+        <w:tc>
+          <w:tcPr>
+            <w:tcW w:type="dxa" w:w="4764"/>
+          </w:tcPr>
+          <w:p>
+            <w:pPr>
+              <w:spacing w:before="0" w:after="0"/>
+            </w:pPr>
+            <w:r>
+              <w:rPr>
+                <w:sz w:val="20"/>
+              </w:rPr>
+              <w:t>The structure of a product tends to copy the structure of the organisation behind it (Conway 1968).</w:t>
+            </w:r>
+          </w:p>
+        </w:tc>
+        <w:tc>
+          <w:tcPr>
+            <w:tcW w:type="dxa" w:w="3011"/>
+          </w:tcPr>
+          <w:p>
+            <w:pPr>
+              <w:spacing w:before="0" w:after="0"/>
+            </w:pPr>
+            <w:r>
+              <w:rPr>
+                <w:sz w:val="20"/>
+              </w:rPr>
+              <w:t>Name one owner of sizes, limits and chunking.</w:t>
+            </w:r>
+          </w:p>
+        </w:tc>
+      </w:tr>
+      <w:tr>
+        <w:trPr>
+          <w:cantSplit/>
+        </w:trPr>
+        <w:tc>
+          <w:tcPr>
+            <w:tcW w:type="dxa" w:w="1863"/>
+          </w:tcPr>
+          <w:p>
+            <w:pPr>
+              <w:spacing w:before="0" w:after="0"/>
+            </w:pPr>
+            <w:r>
+              <w:rPr>
+                <w:sz w:val="20"/>
+              </w:rPr>
+              <w:t>How an exception is decided</w:t>
+            </w:r>
+          </w:p>
+        </w:tc>
+        <w:tc>
+          <w:tcPr>
+            <w:tcW w:type="dxa" w:w="4764"/>
+          </w:tcPr>
+          <w:p>
+            <w:pPr>
+              <w:spacing w:before="0" w:after="0"/>
+            </w:pPr>
+            <w:r>
+              <w:rPr>
+                <w:sz w:val="20"/>
+              </w:rPr>
+              <w:t>WCAG 2.5.8 allows exceptions only in set cases, such as enough space between small targets.</w:t>
+            </w:r>
+          </w:p>
+        </w:tc>
+        <w:tc>
+          <w:tcPr>
+            <w:tcW w:type="dxa" w:w="3011"/>
+          </w:tcPr>
+          <w:p>
+            <w:pPr>
+              <w:spacing w:before="0" w:after="0"/>
+            </w:pPr>
+            <w:r>
+              <w:rPr>
+                <w:sz w:val="20"/>
+              </w:rPr>
+              <w:t>Write down when an exception is allowed and who decides.</w:t>
+            </w:r>
+          </w:p>
+        </w:tc>
+      </w:tr>
+      <w:tr>
+        <w:trPr>
+          <w:cantSplit/>
+        </w:trPr>
+        <w:tc>
+          <w:tcPr>
+            <w:tcW w:type="dxa" w:w="1863"/>
+          </w:tcPr>
+          <w:p>
+            <w:pPr>
+              <w:spacing w:before="0" w:after="0"/>
+            </w:pPr>
+            <w:r>
+              <w:rPr>
+                <w:sz w:val="20"/>
+              </w:rPr>
+              <w:t>How a standard changes</w:t>
+            </w:r>
+          </w:p>
+        </w:tc>
+        <w:tc>
+          <w:tcPr>
+            <w:tcW w:type="dxa" w:w="4764"/>
+          </w:tcPr>
+          <w:p>
+            <w:pPr>
+              <w:spacing w:before="0" w:after="0"/>
+            </w:pPr>
+            <w:r>
+              <w:rPr>
+                <w:sz w:val="20"/>
+              </w:rPr>
+              <w:t>Study results can differ: a student replication of the thumb-size study reported a smaller minimum than the original.</w:t>
+            </w:r>
+          </w:p>
+        </w:tc>
+        <w:tc>
+          <w:tcPr>
+            <w:tcW w:type="dxa" w:w="3011"/>
+          </w:tcPr>
+          <w:p>
+            <w:pPr>
+              <w:spacing w:before="0" w:after="0"/>
+            </w:pPr>
+            <w:r>
+              <w:rPr>
+                <w:sz w:val="20"/>
+              </w:rPr>
+              <w:t>Change a standard on evidence from your own users, errors and support.</w:t>
+            </w:r>
+          </w:p>
+        </w:tc>
+      </w:tr>
+    </w:tbl>
+    <w:p>
+      <w:pPr>
+        <w:spacing w:before="0" w:after="80"/>
+      </w:pPr>
+    </w:p>
     <w:tbl>
       <w:tblPr>
         <w:tblW w:w="9598" w:type="dxa"/>
@@ -7269,7 +9508,7 @@
             </w:pPr>
             <w:r>
               <w:rPr/>
-              <w:t>Ticketo, Leon, Mara, Priya and Tobias are made up for this example. Deciding with limited information follows Simon (1956); the premortem follows Klein (2007).</w:t>
+              <w:t>Ticketo, Leon, Mara, Priya and Tobias are made up for this example. Deciding with limited information follows Simon (1956); the premortem follows Klein (2007). The findings in the table of real evidence are real research results, rules and cases; the sources are listed below.</w:t>
             </w:r>
           </w:p>
         </w:tc>
@@ -7448,7 +9687,7 @@
           <w:color w:val="556274"/>
           <w:sz w:val="18"/>
         </w:rPr>
-        <w:t>Simon 1956 · Klein 2007 · WCAG 2.2</w:t>
+        <w:t>Simon 1956 · Klein 2007 · WCAG 2.2 · Conway 1968 · Parhi et al. 2006</w:t>
       </w:r>
     </w:p>
     <w:p>
@@ -8157,6 +10396,18 @@
         <w:rPr>
           <w:sz w:val="19"/>
         </w:rPr>
+        <w:t>Baymard Institute (2024). Cart Abandonment Rate Statistics. https://baymard.com/lists/cart-abandonment-rate (Average cart abandonment of 70.19% across all reasons; in the checkout study, 17% of the US online shoppers had abandoned an order in the past quarter because the checkout seemed too long or complicated; the figures change with the study year.)</w:t>
+      </w:r>
+    </w:p>
+    <w:p>
+      <w:pPr>
+        <w:spacing w:before="0" w:after="80"/>
+        <w:ind w:left="283" w:hanging="283"/>
+      </w:pPr>
+      <w:r>
+        <w:rPr>
+          <w:sz w:val="19"/>
+        </w:rPr>
         <w:t>Hick, W. E. (1952). On the rate of gain of information. Quarterly Journal of Experimental Psychology, 4(1), 11–26. (Choice reaction time rises with the number of equally likely alternatives: Hick's law.)</w:t>
       </w:r>
     </w:p>
@@ -8194,6 +10445,18 @@
           <w:sz w:val="19"/>
         </w:rPr>
         <w:t>Nielsen, J. (2006). Progressive Disclosure. Nielsen Norman Group. https://www.nngroup.com/articles/progressive-disclosure/ (Show the few most important options first and the rest on request; it helps both new and experienced users.)</w:t>
+      </w:r>
+    </w:p>
+    <w:p>
+      <w:pPr>
+        <w:spacing w:before="0" w:after="80"/>
+        <w:ind w:left="283" w:hanging="283"/>
+      </w:pPr>
+      <w:r>
+        <w:rPr>
+          <w:sz w:val="19"/>
+        </w:rPr>
+        <w:t>Larson, K., &amp; Czerwinski, M. (1998). Web page design: Implications of memory, structure and scent for information retrieval. CHI '98, 25–32. https://doi.org/10.1145/274644.274649 (More depth harmed search on the web, and a medium structure of depth and breadth beat the broadest, shallowest one.)</w:t>
       </w:r>
     </w:p>
     <w:p>
@@ -8253,7 +10516,19 @@
         <w:rPr>
           <w:sz w:val="19"/>
         </w:rPr>
-        <w:t>Yablonski, J. (2020). Laws of UX: Using Psychology to Design Better Products &amp; Services. O'Reilly. (Hick's, Fitts's and Jakob's law, Miller's rule and other principles as practical tools for interface decisions.)</w:t>
+        <w:t>Chase, W. G., &amp; Simon, H. A. (1973). Perception in chess. Cognitive Psychology, 4(1), 55–81. (Chess masters recalled real game positions as a few meaningful chunks; for randomly placed pieces the advantage largely disappeared.)</w:t>
+      </w:r>
+    </w:p>
+    <w:p>
+      <w:pPr>
+        <w:spacing w:before="0" w:after="80"/>
+        <w:ind w:left="283" w:hanging="283"/>
+      </w:pPr>
+      <w:r>
+        <w:rPr>
+          <w:sz w:val="19"/>
+        </w:rPr>
+        <w:t>ISO 13616-1:2020. Financial services: International bank account number (IBAN), Part 1. (The IBAN is written in groups of four characters in print.)</w:t>
       </w:r>
     </w:p>
     <w:p>
@@ -8277,7 +10552,31 @@
         <w:rPr>
           <w:sz w:val="19"/>
         </w:rPr>
+        <w:t>Yablonski, J. (2020). Laws of UX: Using Psychology to Design Better Products &amp; Services. O'Reilly. (Hick's, Fitts's and Jakob's law, Miller's rule and other principles as practical tools for interface decisions.)</w:t>
+      </w:r>
+    </w:p>
+    <w:p>
+      <w:pPr>
+        <w:spacing w:before="0" w:after="80"/>
+        <w:ind w:left="283" w:hanging="283"/>
+      </w:pPr>
+      <w:r>
+        <w:rPr>
+          <w:sz w:val="19"/>
+        </w:rPr>
         <w:t>Gibbons, S. (2018). Using Prioritization Matrices to Inform UX Decisions. Nielsen Norman Group. https://www.nngroup.com/articles/prioritization-matrices/ (Rate each option on the same few criteria, such as value to the user against effort, and put the reason next to each rating.)</w:t>
+      </w:r>
+    </w:p>
+    <w:p>
+      <w:pPr>
+        <w:spacing w:before="0" w:after="80"/>
+        <w:ind w:left="283" w:hanging="283"/>
+      </w:pPr>
+      <w:r>
+        <w:rPr>
+          <w:sz w:val="19"/>
+        </w:rPr>
+        <w:t>Standing, L. (1973). Learning 10,000 pictures. Quarterly Journal of Experimental Psychology, 25(2), 207–222. https://doi.org/10.1080/14640747308400340 (Recognition memory for pictures has an almost limitless capacity: no sign of saturation after 10,000 pictures.)</w:t>
       </w:r>
     </w:p>
     <w:p>
@@ -8314,6 +10613,18 @@
           <w:sz w:val="19"/>
         </w:rPr>
         <w:t>Klein, G. (2007). Performing a project premortem. Harvard Business Review, 85(9), 18–19. (Imagine the plan has failed and ask why; it brings risks and wrong assumptions to the surface before the work starts.)</w:t>
+      </w:r>
+    </w:p>
+    <w:p>
+      <w:pPr>
+        <w:spacing w:before="0" w:after="80"/>
+        <w:ind w:left="283" w:hanging="283"/>
+      </w:pPr>
+      <w:r>
+        <w:rPr>
+          <w:sz w:val="19"/>
+        </w:rPr>
+        <w:t>Conway, M. E. (1968). How do committees invent? Datamation, 14(4), 28–31. (Organisations tend to produce designs that copy their own communication structure: the menu mirrors the departments.)</w:t>
       </w:r>
     </w:p>
     <w:p>
@@ -8362,9 +10673,9 @@
         </w:tblCellMar>
       </w:tblPr>
       <w:tblGrid>
-        <w:gridCol w:w="1933"/>
-        <w:gridCol w:w="5688"/>
-        <w:gridCol w:w="1095"/>
+        <w:gridCol w:w="1931"/>
+        <w:gridCol w:w="5689"/>
+        <w:gridCol w:w="1096"/>
         <w:gridCol w:w="922"/>
       </w:tblGrid>
       <w:tr>
@@ -8374,7 +10685,7 @@
         </w:trPr>
         <w:tc>
           <w:tcPr>
-            <w:tcW w:type="dxa" w:w="1933"/>
+            <w:tcW w:type="dxa" w:w="1931"/>
             <w:shd w:val="clear" w:color="auto" w:fill="E6ECF4"/>
           </w:tcPr>
           <w:p>
@@ -8392,7 +10703,7 @@
         </w:tc>
         <w:tc>
           <w:tcPr>
-            <w:tcW w:type="dxa" w:w="5688"/>
+            <w:tcW w:type="dxa" w:w="5689"/>
             <w:shd w:val="clear" w:color="auto" w:fill="E6ECF4"/>
           </w:tcPr>
           <w:p>
@@ -8410,7 +10721,7 @@
         </w:tc>
         <w:tc>
           <w:tcPr>
-            <w:tcW w:type="dxa" w:w="1095"/>
+            <w:tcW w:type="dxa" w:w="1096"/>
             <w:shd w:val="clear" w:color="auto" w:fill="E6ECF4"/>
           </w:tcPr>
           <w:p>
@@ -8451,7 +10762,7 @@
         </w:trPr>
         <w:tc>
           <w:tcPr>
-            <w:tcW w:type="dxa" w:w="1933"/>
+            <w:tcW w:type="dxa" w:w="1931"/>
           </w:tcPr>
           <w:p>
             <w:pPr>
@@ -8468,7 +10779,7 @@
         </w:tc>
         <w:tc>
           <w:tcPr>
-            <w:tcW w:type="dxa" w:w="5688"/>
+            <w:tcW w:type="dxa" w:w="5689"/>
           </w:tcPr>
           <w:p>
             <w:pPr>
@@ -8484,7 +10795,7 @@
         </w:tc>
         <w:tc>
           <w:tcPr>
-            <w:tcW w:type="dxa" w:w="1095"/>
+            <w:tcW w:type="dxa" w:w="1096"/>
           </w:tcPr>
           <w:p>
             <w:pPr>
@@ -8521,7 +10832,7 @@
         </w:trPr>
         <w:tc>
           <w:tcPr>
-            <w:tcW w:type="dxa" w:w="1933"/>
+            <w:tcW w:type="dxa" w:w="1931"/>
           </w:tcPr>
           <w:p>
             <w:pPr>
@@ -8538,7 +10849,7 @@
         </w:tc>
         <w:tc>
           <w:tcPr>
-            <w:tcW w:type="dxa" w:w="5688"/>
+            <w:tcW w:type="dxa" w:w="5689"/>
           </w:tcPr>
           <w:p>
             <w:pPr>
@@ -8554,7 +10865,7 @@
         </w:tc>
         <w:tc>
           <w:tcPr>
-            <w:tcW w:type="dxa" w:w="1095"/>
+            <w:tcW w:type="dxa" w:w="1096"/>
           </w:tcPr>
           <w:p>
             <w:pPr>
@@ -8591,7 +10902,7 @@
         </w:trPr>
         <w:tc>
           <w:tcPr>
-            <w:tcW w:type="dxa" w:w="1933"/>
+            <w:tcW w:type="dxa" w:w="1931"/>
           </w:tcPr>
           <w:p>
             <w:pPr>
@@ -8608,7 +10919,7 @@
         </w:tc>
         <w:tc>
           <w:tcPr>
-            <w:tcW w:type="dxa" w:w="5688"/>
+            <w:tcW w:type="dxa" w:w="5689"/>
           </w:tcPr>
           <w:p>
             <w:pPr>
@@ -8624,7 +10935,7 @@
         </w:tc>
         <w:tc>
           <w:tcPr>
-            <w:tcW w:type="dxa" w:w="1095"/>
+            <w:tcW w:type="dxa" w:w="1096"/>
           </w:tcPr>
           <w:p>
             <w:pPr>
@@ -8661,7 +10972,7 @@
         </w:trPr>
         <w:tc>
           <w:tcPr>
-            <w:tcW w:type="dxa" w:w="1933"/>
+            <w:tcW w:type="dxa" w:w="1931"/>
           </w:tcPr>
           <w:p>
             <w:pPr>
@@ -8678,7 +10989,7 @@
         </w:tc>
         <w:tc>
           <w:tcPr>
-            <w:tcW w:type="dxa" w:w="5688"/>
+            <w:tcW w:type="dxa" w:w="5689"/>
           </w:tcPr>
           <w:p>
             <w:pPr>
@@ -8694,7 +11005,7 @@
         </w:tc>
         <w:tc>
           <w:tcPr>
-            <w:tcW w:type="dxa" w:w="1095"/>
+            <w:tcW w:type="dxa" w:w="1096"/>
           </w:tcPr>
           <w:p>
             <w:pPr>
@@ -8731,7 +11042,7 @@
         </w:trPr>
         <w:tc>
           <w:tcPr>
-            <w:tcW w:type="dxa" w:w="1933"/>
+            <w:tcW w:type="dxa" w:w="1931"/>
           </w:tcPr>
           <w:p>
             <w:pPr>
@@ -8742,13 +11053,13 @@
                 <w:b/>
                 <w:sz w:val="19"/>
               </w:rPr>
-              <w:t>Decision effort</w:t>
-            </w:r>
-          </w:p>
-        </w:tc>
-        <w:tc>
-          <w:tcPr>
-            <w:tcW w:type="dxa" w:w="5688"/>
+              <w:t>Consistency</w:t>
+            </w:r>
+          </w:p>
+        </w:tc>
+        <w:tc>
+          <w:tcPr>
+            <w:tcW w:type="dxa" w:w="5689"/>
           </w:tcPr>
           <w:p>
             <w:pPr>
@@ -8758,13 +11069,13 @@
               <w:rPr>
                 <w:sz w:val="19"/>
               </w:rPr>
-              <w:t>The mental work of comparing options and choosing one. Many equal options raise it.</w:t>
-            </w:r>
-          </w:p>
-        </w:tc>
-        <w:tc>
-          <w:tcPr>
-            <w:tcW w:type="dxa" w:w="1095"/>
+              <w:t>The same thing looks, is named and works the same way everywhere, so what people learn on one page holds on the next.</w:t>
+            </w:r>
+          </w:p>
+        </w:tc>
+        <w:tc>
+          <w:tcPr>
+            <w:tcW w:type="dxa" w:w="1096"/>
           </w:tcPr>
           <w:p>
             <w:pPr>
@@ -8790,7 +11101,7 @@
               <w:rPr>
                 <w:sz w:val="19"/>
               </w:rPr>
-              <w:t>Day 4</w:t>
+              <w:t>Day 2</w:t>
             </w:r>
           </w:p>
         </w:tc>
@@ -8801,7 +11112,7 @@
         </w:trPr>
         <w:tc>
           <w:tcPr>
-            <w:tcW w:type="dxa" w:w="1933"/>
+            <w:tcW w:type="dxa" w:w="1931"/>
           </w:tcPr>
           <w:p>
             <w:pPr>
@@ -8812,13 +11123,13 @@
                 <w:b/>
                 <w:sz w:val="19"/>
               </w:rPr>
-              <w:t>Decision stress</w:t>
-            </w:r>
-          </w:p>
-        </w:tc>
-        <w:tc>
-          <w:tcPr>
-            <w:tcW w:type="dxa" w:w="5688"/>
+              <w:t>Decision effort</w:t>
+            </w:r>
+          </w:p>
+        </w:tc>
+        <w:tc>
+          <w:tcPr>
+            <w:tcW w:type="dxa" w:w="5689"/>
           </w:tcPr>
           <w:p>
             <w:pPr>
@@ -8828,13 +11139,13 @@
               <w:rPr>
                 <w:sz w:val="19"/>
               </w:rPr>
-              <w:t>The strain people feel when they have to choose between many similar options and fear choosing wrongly.</w:t>
-            </w:r>
-          </w:p>
-        </w:tc>
-        <w:tc>
-          <w:tcPr>
-            <w:tcW w:type="dxa" w:w="1095"/>
+              <w:t>The mental work of comparing options and choosing one. Many equal options raise it.</w:t>
+            </w:r>
+          </w:p>
+        </w:tc>
+        <w:tc>
+          <w:tcPr>
+            <w:tcW w:type="dxa" w:w="1096"/>
           </w:tcPr>
           <w:p>
             <w:pPr>
@@ -8860,7 +11171,7 @@
               <w:rPr>
                 <w:sz w:val="19"/>
               </w:rPr>
-              <w:t>Day 5</w:t>
+              <w:t>Day 4</w:t>
             </w:r>
           </w:p>
         </w:tc>
@@ -8871,7 +11182,7 @@
         </w:trPr>
         <w:tc>
           <w:tcPr>
-            <w:tcW w:type="dxa" w:w="1933"/>
+            <w:tcW w:type="dxa" w:w="1931"/>
           </w:tcPr>
           <w:p>
             <w:pPr>
@@ -8882,13 +11193,13 @@
                 <w:b/>
                 <w:sz w:val="19"/>
               </w:rPr>
-              <w:t>Error probability</w:t>
-            </w:r>
-          </w:p>
-        </w:tc>
-        <w:tc>
-          <w:tcPr>
-            <w:tcW w:type="dxa" w:w="5688"/>
+              <w:t>Decision stress</w:t>
+            </w:r>
+          </w:p>
+        </w:tc>
+        <w:tc>
+          <w:tcPr>
+            <w:tcW w:type="dxa" w:w="5689"/>
           </w:tcPr>
           <w:p>
             <w:pPr>
@@ -8898,13 +11209,13 @@
               <w:rPr>
                 <w:sz w:val="19"/>
               </w:rPr>
-              <w:t>How likely a person is to make a mistake at a given step. Small targets, many similar options and things to remember all raise it.</w:t>
-            </w:r>
-          </w:p>
-        </w:tc>
-        <w:tc>
-          <w:tcPr>
-            <w:tcW w:type="dxa" w:w="1095"/>
+              <w:t>The strain people feel when they have to choose between many similar options and fear choosing wrongly.</w:t>
+            </w:r>
+          </w:p>
+        </w:tc>
+        <w:tc>
+          <w:tcPr>
+            <w:tcW w:type="dxa" w:w="1096"/>
           </w:tcPr>
           <w:p>
             <w:pPr>
@@ -8941,7 +11252,7 @@
         </w:trPr>
         <w:tc>
           <w:tcPr>
-            <w:tcW w:type="dxa" w:w="1933"/>
+            <w:tcW w:type="dxa" w:w="1931"/>
           </w:tcPr>
           <w:p>
             <w:pPr>
@@ -8952,13 +11263,13 @@
                 <w:b/>
                 <w:sz w:val="19"/>
               </w:rPr>
-              <w:t>Findability</w:t>
-            </w:r>
-          </w:p>
-        </w:tc>
-        <w:tc>
-          <w:tcPr>
-            <w:tcW w:type="dxa" w:w="5688"/>
+              <w:t>Error probability</w:t>
+            </w:r>
+          </w:p>
+        </w:tc>
+        <w:tc>
+          <w:tcPr>
+            <w:tcW w:type="dxa" w:w="5689"/>
           </w:tcPr>
           <w:p>
             <w:pPr>
@@ -8968,13 +11279,13 @@
               <w:rPr>
                 <w:sz w:val="19"/>
               </w:rPr>
-              <w:t>How easily people can find what they are looking for, by browsing the menu or by searching.</w:t>
-            </w:r>
-          </w:p>
-        </w:tc>
-        <w:tc>
-          <w:tcPr>
-            <w:tcW w:type="dxa" w:w="1095"/>
+              <w:t>How likely a person is to make a mistake at a given step. Small targets, many similar options and things to remember all raise it.</w:t>
+            </w:r>
+          </w:p>
+        </w:tc>
+        <w:tc>
+          <w:tcPr>
+            <w:tcW w:type="dxa" w:w="1096"/>
           </w:tcPr>
           <w:p>
             <w:pPr>
@@ -9000,7 +11311,7 @@
               <w:rPr>
                 <w:sz w:val="19"/>
               </w:rPr>
-              <w:t>Day 2</w:t>
+              <w:t>Day 5</w:t>
             </w:r>
           </w:p>
         </w:tc>
@@ -9011,7 +11322,7 @@
         </w:trPr>
         <w:tc>
           <w:tcPr>
-            <w:tcW w:type="dxa" w:w="1933"/>
+            <w:tcW w:type="dxa" w:w="1931"/>
           </w:tcPr>
           <w:p>
             <w:pPr>
@@ -9022,13 +11333,13 @@
                 <w:b/>
                 <w:sz w:val="19"/>
               </w:rPr>
-              <w:t>Fitts's law</w:t>
-            </w:r>
-          </w:p>
-        </w:tc>
-        <w:tc>
-          <w:tcPr>
-            <w:tcW w:type="dxa" w:w="5688"/>
+              <w:t>Findability</w:t>
+            </w:r>
+          </w:p>
+        </w:tc>
+        <w:tc>
+          <w:tcPr>
+            <w:tcW w:type="dxa" w:w="5689"/>
           </w:tcPr>
           <w:p>
             <w:pPr>
@@ -9038,13 +11349,13 @@
               <w:rPr>
                 <w:sz w:val="19"/>
               </w:rPr>
-              <w:t>A target is reached faster and missed less often when it is large and close. Small, distant buttons cost time and cause wrong taps.</w:t>
-            </w:r>
-          </w:p>
-        </w:tc>
-        <w:tc>
-          <w:tcPr>
-            <w:tcW w:type="dxa" w:w="1095"/>
+              <w:t>How easily people can find what they are looking for, by browsing the menu or by searching.</w:t>
+            </w:r>
+          </w:p>
+        </w:tc>
+        <w:tc>
+          <w:tcPr>
+            <w:tcW w:type="dxa" w:w="1096"/>
           </w:tcPr>
           <w:p>
             <w:pPr>
@@ -9070,7 +11381,7 @@
               <w:rPr>
                 <w:sz w:val="19"/>
               </w:rPr>
-              <w:t>Day 4</w:t>
+              <w:t>Day 2</w:t>
             </w:r>
           </w:p>
         </w:tc>
@@ -9081,7 +11392,7 @@
         </w:trPr>
         <w:tc>
           <w:tcPr>
-            <w:tcW w:type="dxa" w:w="1933"/>
+            <w:tcW w:type="dxa" w:w="1931"/>
           </w:tcPr>
           <w:p>
             <w:pPr>
@@ -9092,13 +11403,13 @@
                 <w:b/>
                 <w:sz w:val="19"/>
               </w:rPr>
-              <w:t>Governance</w:t>
-            </w:r>
-          </w:p>
-        </w:tc>
-        <w:tc>
-          <w:tcPr>
-            <w:tcW w:type="dxa" w:w="5688"/>
+              <w:t>Fitts's law</w:t>
+            </w:r>
+          </w:p>
+        </w:tc>
+        <w:tc>
+          <w:tcPr>
+            <w:tcW w:type="dxa" w:w="5689"/>
           </w:tcPr>
           <w:p>
             <w:pPr>
@@ -9108,13 +11419,13 @@
               <w:rPr>
                 <w:sz w:val="19"/>
               </w:rPr>
-              <w:t>The rules about who may decide what, who is answerable for it and how disagreements are settled.</w:t>
-            </w:r>
-          </w:p>
-        </w:tc>
-        <w:tc>
-          <w:tcPr>
-            <w:tcW w:type="dxa" w:w="1095"/>
+              <w:t>A target is reached faster and missed less often when it is large and close. Small, distant buttons cost time and cause wrong taps.</w:t>
+            </w:r>
+          </w:p>
+        </w:tc>
+        <w:tc>
+          <w:tcPr>
+            <w:tcW w:type="dxa" w:w="1096"/>
           </w:tcPr>
           <w:p>
             <w:pPr>
@@ -9140,7 +11451,7 @@
               <w:rPr>
                 <w:sz w:val="19"/>
               </w:rPr>
-              <w:t>Day 1</w:t>
+              <w:t>Day 4</w:t>
             </w:r>
           </w:p>
         </w:tc>
@@ -9151,7 +11462,7 @@
         </w:trPr>
         <w:tc>
           <w:tcPr>
-            <w:tcW w:type="dxa" w:w="1933"/>
+            <w:tcW w:type="dxa" w:w="1931"/>
           </w:tcPr>
           <w:p>
             <w:pPr>
@@ -9162,13 +11473,13 @@
                 <w:b/>
                 <w:sz w:val="19"/>
               </w:rPr>
-              <w:t>Grouping</w:t>
-            </w:r>
-          </w:p>
-        </w:tc>
-        <w:tc>
-          <w:tcPr>
-            <w:tcW w:type="dxa" w:w="5688"/>
+              <w:t>Governance</w:t>
+            </w:r>
+          </w:p>
+        </w:tc>
+        <w:tc>
+          <w:tcPr>
+            <w:tcW w:type="dxa" w:w="5689"/>
           </w:tcPr>
           <w:p>
             <w:pPr>
@@ -9178,13 +11489,13 @@
               <w:rPr>
                 <w:sz w:val="19"/>
               </w:rPr>
-              <w:t>Showing what belongs together, for example by putting it close together or making it look alike. The eye reads a group as one unit.</w:t>
-            </w:r>
-          </w:p>
-        </w:tc>
-        <w:tc>
-          <w:tcPr>
-            <w:tcW w:type="dxa" w:w="1095"/>
+              <w:t>The rules about who may decide what, who is answerable for it and how disagreements are settled.</w:t>
+            </w:r>
+          </w:p>
+        </w:tc>
+        <w:tc>
+          <w:tcPr>
+            <w:tcW w:type="dxa" w:w="1096"/>
           </w:tcPr>
           <w:p>
             <w:pPr>
@@ -9210,7 +11521,7 @@
               <w:rPr>
                 <w:sz w:val="19"/>
               </w:rPr>
-              <w:t>Day 2</w:t>
+              <w:t>Day 1</w:t>
             </w:r>
           </w:p>
         </w:tc>
@@ -9221,7 +11532,7 @@
         </w:trPr>
         <w:tc>
           <w:tcPr>
-            <w:tcW w:type="dxa" w:w="1933"/>
+            <w:tcW w:type="dxa" w:w="1931"/>
           </w:tcPr>
           <w:p>
             <w:pPr>
@@ -9232,13 +11543,13 @@
                 <w:b/>
                 <w:sz w:val="19"/>
               </w:rPr>
-              <w:t>Hick's law</w:t>
-            </w:r>
-          </w:p>
-        </w:tc>
-        <w:tc>
-          <w:tcPr>
-            <w:tcW w:type="dxa" w:w="5688"/>
+              <w:t>Grouping</w:t>
+            </w:r>
+          </w:p>
+        </w:tc>
+        <w:tc>
+          <w:tcPr>
+            <w:tcW w:type="dxa" w:w="5689"/>
           </w:tcPr>
           <w:p>
             <w:pPr>
@@ -9248,13 +11559,13 @@
               <w:rPr>
                 <w:sz w:val="19"/>
               </w:rPr>
-              <w:t>The more equally weighted options people have to choose from, the longer the decision takes. It matters most for unfamiliar options that look alike.</w:t>
-            </w:r>
-          </w:p>
-        </w:tc>
-        <w:tc>
-          <w:tcPr>
-            <w:tcW w:type="dxa" w:w="1095"/>
+              <w:t>Showing what belongs together, for example by putting it close together or making it look alike. The eye reads a group as one unit.</w:t>
+            </w:r>
+          </w:p>
+        </w:tc>
+        <w:tc>
+          <w:tcPr>
+            <w:tcW w:type="dxa" w:w="1096"/>
           </w:tcPr>
           <w:p>
             <w:pPr>
@@ -9280,7 +11591,7 @@
               <w:rPr>
                 <w:sz w:val="19"/>
               </w:rPr>
-              <w:t>Day 4</w:t>
+              <w:t>Day 2</w:t>
             </w:r>
           </w:p>
         </w:tc>
@@ -9291,7 +11602,7 @@
         </w:trPr>
         <w:tc>
           <w:tcPr>
-            <w:tcW w:type="dxa" w:w="1933"/>
+            <w:tcW w:type="dxa" w:w="1931"/>
           </w:tcPr>
           <w:p>
             <w:pPr>
@@ -9302,13 +11613,13 @@
                 <w:b/>
                 <w:sz w:val="19"/>
               </w:rPr>
-              <w:t>Interaction standard</w:t>
-            </w:r>
-          </w:p>
-        </w:tc>
-        <w:tc>
-          <w:tcPr>
-            <w:tcW w:type="dxa" w:w="5688"/>
+              <w:t>Hick's law</w:t>
+            </w:r>
+          </w:p>
+        </w:tc>
+        <w:tc>
+          <w:tcPr>
+            <w:tcW w:type="dxa" w:w="5689"/>
           </w:tcPr>
           <w:p>
             <w:pPr>
@@ -9318,13 +11629,13 @@
               <w:rPr>
                 <w:sz w:val="19"/>
               </w:rPr>
-              <w:t>A written rule every team follows for how interaction works, such as a minimum target size, one main action per screen or a limit on equal options.</w:t>
-            </w:r>
-          </w:p>
-        </w:tc>
-        <w:tc>
-          <w:tcPr>
-            <w:tcW w:type="dxa" w:w="1095"/>
+              <w:t>The more equally weighted options people have to choose from, the longer the decision takes. It matters most for unfamiliar options that look alike.</w:t>
+            </w:r>
+          </w:p>
+        </w:tc>
+        <w:tc>
+          <w:tcPr>
+            <w:tcW w:type="dxa" w:w="1096"/>
           </w:tcPr>
           <w:p>
             <w:pPr>
@@ -9350,7 +11661,7 @@
               <w:rPr>
                 <w:sz w:val="19"/>
               </w:rPr>
-              <w:t>Day 5</w:t>
+              <w:t>Day 4</w:t>
             </w:r>
           </w:p>
         </w:tc>
@@ -9361,7 +11672,7 @@
         </w:trPr>
         <w:tc>
           <w:tcPr>
-            <w:tcW w:type="dxa" w:w="1933"/>
+            <w:tcW w:type="dxa" w:w="1931"/>
           </w:tcPr>
           <w:p>
             <w:pPr>
@@ -9372,13 +11683,13 @@
                 <w:b/>
                 <w:sz w:val="19"/>
               </w:rPr>
-              <w:t>Memory load</w:t>
-            </w:r>
-          </w:p>
-        </w:tc>
-        <w:tc>
-          <w:tcPr>
-            <w:tcW w:type="dxa" w:w="5688"/>
+              <w:t>Interaction standard</w:t>
+            </w:r>
+          </w:p>
+        </w:tc>
+        <w:tc>
+          <w:tcPr>
+            <w:tcW w:type="dxa" w:w="5689"/>
           </w:tcPr>
           <w:p>
             <w:pPr>
@@ -9388,13 +11699,13 @@
               <w:rPr>
                 <w:sz w:val="19"/>
               </w:rPr>
-              <w:t>How much a person has to keep in mind while using an interface, such as a number from an earlier screen or the option chosen two steps back.</w:t>
-            </w:r>
-          </w:p>
-        </w:tc>
-        <w:tc>
-          <w:tcPr>
-            <w:tcW w:type="dxa" w:w="1095"/>
+              <w:t>A written rule every team follows for how interaction works, such as a minimum target size, one main action per screen or a limit on equal options.</w:t>
+            </w:r>
+          </w:p>
+        </w:tc>
+        <w:tc>
+          <w:tcPr>
+            <w:tcW w:type="dxa" w:w="1096"/>
           </w:tcPr>
           <w:p>
             <w:pPr>
@@ -9420,7 +11731,7 @@
               <w:rPr>
                 <w:sz w:val="19"/>
               </w:rPr>
-              <w:t>Day 4</w:t>
+              <w:t>Day 5</w:t>
             </w:r>
           </w:p>
         </w:tc>
@@ -9431,7 +11742,7 @@
         </w:trPr>
         <w:tc>
           <w:tcPr>
-            <w:tcW w:type="dxa" w:w="1933"/>
+            <w:tcW w:type="dxa" w:w="1931"/>
           </w:tcPr>
           <w:p>
             <w:pPr>
@@ -9442,13 +11753,13 @@
                 <w:b/>
                 <w:sz w:val="19"/>
               </w:rPr>
-              <w:t>Miller's rule</w:t>
-            </w:r>
-          </w:p>
-        </w:tc>
-        <w:tc>
-          <w:tcPr>
-            <w:tcW w:type="dxa" w:w="5688"/>
+              <w:t>Memory load</w:t>
+            </w:r>
+          </w:p>
+        </w:tc>
+        <w:tc>
+          <w:tcPr>
+            <w:tcW w:type="dxa" w:w="5689"/>
           </w:tcPr>
           <w:p>
             <w:pPr>
@@ -9458,13 +11769,13 @@
               <w:rPr>
                 <w:sz w:val="19"/>
               </w:rPr>
-              <w:t>Short-term memory holds only a few things at once, about seven in Miller's old estimate and nearer four in later research. Interfaces should not make people remember what the system knows.</w:t>
-            </w:r>
-          </w:p>
-        </w:tc>
-        <w:tc>
-          <w:tcPr>
-            <w:tcW w:type="dxa" w:w="1095"/>
+              <w:t>How much a person has to keep in mind while using an interface, such as a number from an earlier screen or the option chosen two steps back.</w:t>
+            </w:r>
+          </w:p>
+        </w:tc>
+        <w:tc>
+          <w:tcPr>
+            <w:tcW w:type="dxa" w:w="1096"/>
           </w:tcPr>
           <w:p>
             <w:pPr>
@@ -9501,7 +11812,7 @@
         </w:trPr>
         <w:tc>
           <w:tcPr>
-            <w:tcW w:type="dxa" w:w="1933"/>
+            <w:tcW w:type="dxa" w:w="1931"/>
           </w:tcPr>
           <w:p>
             <w:pPr>
@@ -9512,13 +11823,13 @@
                 <w:b/>
                 <w:sz w:val="19"/>
               </w:rPr>
-              <w:t>Mis-tap</w:t>
-            </w:r>
-          </w:p>
-        </w:tc>
-        <w:tc>
-          <w:tcPr>
-            <w:tcW w:type="dxa" w:w="5688"/>
+              <w:t>Miller's rule</w:t>
+            </w:r>
+          </w:p>
+        </w:tc>
+        <w:tc>
+          <w:tcPr>
+            <w:tcW w:type="dxa" w:w="5689"/>
           </w:tcPr>
           <w:p>
             <w:pPr>
@@ -9528,13 +11839,13 @@
               <w:rPr>
                 <w:sz w:val="19"/>
               </w:rPr>
-              <w:t>A tap that hits the wrong target, often because targets are small or close together.</w:t>
-            </w:r>
-          </w:p>
-        </w:tc>
-        <w:tc>
-          <w:tcPr>
-            <w:tcW w:type="dxa" w:w="1095"/>
+              <w:t>Short-term memory holds only a few things at once, about seven in Miller's old estimate and nearer four in later research. Interfaces should not make people remember what the system knows.</w:t>
+            </w:r>
+          </w:p>
+        </w:tc>
+        <w:tc>
+          <w:tcPr>
+            <w:tcW w:type="dxa" w:w="1096"/>
           </w:tcPr>
           <w:p>
             <w:pPr>
@@ -9560,7 +11871,7 @@
               <w:rPr>
                 <w:sz w:val="19"/>
               </w:rPr>
-              <w:t>Day 5</w:t>
+              <w:t>Day 4</w:t>
             </w:r>
           </w:p>
         </w:tc>
@@ -9571,7 +11882,7 @@
         </w:trPr>
         <w:tc>
           <w:tcPr>
-            <w:tcW w:type="dxa" w:w="1933"/>
+            <w:tcW w:type="dxa" w:w="1931"/>
           </w:tcPr>
           <w:p>
             <w:pPr>
@@ -9582,13 +11893,13 @@
                 <w:b/>
                 <w:sz w:val="19"/>
               </w:rPr>
-              <w:t>Mobile usability</w:t>
-            </w:r>
-          </w:p>
-        </w:tc>
-        <w:tc>
-          <w:tcPr>
-            <w:tcW w:type="dxa" w:w="5688"/>
+              <w:t>Mis-tap</w:t>
+            </w:r>
+          </w:p>
+        </w:tc>
+        <w:tc>
+          <w:tcPr>
+            <w:tcW w:type="dxa" w:w="5689"/>
           </w:tcPr>
           <w:p>
             <w:pPr>
@@ -9598,13 +11909,13 @@
               <w:rPr>
                 <w:sz w:val="19"/>
               </w:rPr>
-              <w:t>How well a product can be used on a phone: one-handed, on a small screen, often on the move.</w:t>
-            </w:r>
-          </w:p>
-        </w:tc>
-        <w:tc>
-          <w:tcPr>
-            <w:tcW w:type="dxa" w:w="1095"/>
+              <w:t>A tap that hits the wrong target, often because targets are small or close together.</w:t>
+            </w:r>
+          </w:p>
+        </w:tc>
+        <w:tc>
+          <w:tcPr>
+            <w:tcW w:type="dxa" w:w="1096"/>
           </w:tcPr>
           <w:p>
             <w:pPr>
@@ -9641,7 +11952,7 @@
         </w:trPr>
         <w:tc>
           <w:tcPr>
-            <w:tcW w:type="dxa" w:w="1933"/>
+            <w:tcW w:type="dxa" w:w="1931"/>
           </w:tcPr>
           <w:p>
             <w:pPr>
@@ -9652,13 +11963,13 @@
                 <w:b/>
                 <w:sz w:val="19"/>
               </w:rPr>
-              <w:t>Neuro-UX</w:t>
-            </w:r>
-          </w:p>
-        </w:tc>
-        <w:tc>
-          <w:tcPr>
-            <w:tcW w:type="dxa" w:w="5688"/>
+              <w:t>Mobile usability</w:t>
+            </w:r>
+          </w:p>
+        </w:tc>
+        <w:tc>
+          <w:tcPr>
+            <w:tcW w:type="dxa" w:w="5689"/>
           </w:tcPr>
           <w:p>
             <w:pPr>
@@ -9668,13 +11979,13 @@
               <w:rPr>
                 <w:sz w:val="19"/>
               </w:rPr>
-              <w:t>Designing an interface with knowledge of how the brain sees, attends, feels and decides, so that the design steers these processes on purpose and responsibly.</w:t>
-            </w:r>
-          </w:p>
-        </w:tc>
-        <w:tc>
-          <w:tcPr>
-            <w:tcW w:type="dxa" w:w="1095"/>
+              <w:t>How well a product can be used on a phone: one-handed, on a small screen, often on the move.</w:t>
+            </w:r>
+          </w:p>
+        </w:tc>
+        <w:tc>
+          <w:tcPr>
+            <w:tcW w:type="dxa" w:w="1096"/>
           </w:tcPr>
           <w:p>
             <w:pPr>
@@ -9700,7 +12011,7 @@
               <w:rPr>
                 <w:sz w:val="19"/>
               </w:rPr>
-              <w:t>Day 1</w:t>
+              <w:t>Day 5</w:t>
             </w:r>
           </w:p>
         </w:tc>
@@ -9711,7 +12022,7 @@
         </w:trPr>
         <w:tc>
           <w:tcPr>
-            <w:tcW w:type="dxa" w:w="1933"/>
+            <w:tcW w:type="dxa" w:w="1931"/>
           </w:tcPr>
           <w:p>
             <w:pPr>
@@ -9722,13 +12033,13 @@
                 <w:b/>
                 <w:sz w:val="19"/>
               </w:rPr>
-              <w:t>Operating error</w:t>
-            </w:r>
-          </w:p>
-        </w:tc>
-        <w:tc>
-          <w:tcPr>
-            <w:tcW w:type="dxa" w:w="5688"/>
+              <w:t>Neuro-UX</w:t>
+            </w:r>
+          </w:p>
+        </w:tc>
+        <w:tc>
+          <w:tcPr>
+            <w:tcW w:type="dxa" w:w="5689"/>
           </w:tcPr>
           <w:p>
             <w:pPr>
@@ -9738,13 +12049,13 @@
               <w:rPr>
                 <w:sz w:val="19"/>
               </w:rPr>
-              <w:t>A wrong action caused by the interface, such as tapping the wrong button or sending a form twice because nothing confirmed it.</w:t>
-            </w:r>
-          </w:p>
-        </w:tc>
-        <w:tc>
-          <w:tcPr>
-            <w:tcW w:type="dxa" w:w="1095"/>
+              <w:t>Designing an interface with knowledge of how the brain sees, attends, feels and decides, so that the design steers these processes on purpose and responsibly.</w:t>
+            </w:r>
+          </w:p>
+        </w:tc>
+        <w:tc>
+          <w:tcPr>
+            <w:tcW w:type="dxa" w:w="1096"/>
           </w:tcPr>
           <w:p>
             <w:pPr>
@@ -9770,7 +12081,7 @@
               <w:rPr>
                 <w:sz w:val="19"/>
               </w:rPr>
-              <w:t>Day 4</w:t>
+              <w:t>Day 1</w:t>
             </w:r>
           </w:p>
         </w:tc>
@@ -9781,7 +12092,7 @@
         </w:trPr>
         <w:tc>
           <w:tcPr>
-            <w:tcW w:type="dxa" w:w="1933"/>
+            <w:tcW w:type="dxa" w:w="1931"/>
           </w:tcPr>
           <w:p>
             <w:pPr>
@@ -9792,13 +12103,13 @@
                 <w:b/>
                 <w:sz w:val="19"/>
               </w:rPr>
-              <w:t>Primary action</w:t>
-            </w:r>
-          </w:p>
-        </w:tc>
-        <w:tc>
-          <w:tcPr>
-            <w:tcW w:type="dxa" w:w="5688"/>
+              <w:t>Operating error</w:t>
+            </w:r>
+          </w:p>
+        </w:tc>
+        <w:tc>
+          <w:tcPr>
+            <w:tcW w:type="dxa" w:w="5689"/>
           </w:tcPr>
           <w:p>
             <w:pPr>
@@ -9808,13 +12119,13 @@
               <w:rPr>
                 <w:sz w:val="19"/>
               </w:rPr>
-              <w:t>The one thing most people on a screen came to do, such as “Report damage”. It should be the easiest thing to see and press.</w:t>
-            </w:r>
-          </w:p>
-        </w:tc>
-        <w:tc>
-          <w:tcPr>
-            <w:tcW w:type="dxa" w:w="1095"/>
+              <w:t>A wrong action caused by the interface, such as tapping the wrong button or sending a form twice because nothing confirmed it.</w:t>
+            </w:r>
+          </w:p>
+        </w:tc>
+        <w:tc>
+          <w:tcPr>
+            <w:tcW w:type="dxa" w:w="1096"/>
           </w:tcPr>
           <w:p>
             <w:pPr>
@@ -9840,7 +12151,7 @@
               <w:rPr>
                 <w:sz w:val="19"/>
               </w:rPr>
-              <w:t>Day 1</w:t>
+              <w:t>Day 4</w:t>
             </w:r>
           </w:p>
         </w:tc>
@@ -9851,7 +12162,7 @@
         </w:trPr>
         <w:tc>
           <w:tcPr>
-            <w:tcW w:type="dxa" w:w="1933"/>
+            <w:tcW w:type="dxa" w:w="1931"/>
           </w:tcPr>
           <w:p>
             <w:pPr>
@@ -9862,13 +12173,13 @@
                 <w:b/>
                 <w:sz w:val="19"/>
               </w:rPr>
-              <w:t>Progressive disclosure</w:t>
-            </w:r>
-          </w:p>
-        </w:tc>
-        <w:tc>
-          <w:tcPr>
-            <w:tcW w:type="dxa" w:w="5688"/>
+              <w:t>Primary action</w:t>
+            </w:r>
+          </w:p>
+        </w:tc>
+        <w:tc>
+          <w:tcPr>
+            <w:tcW w:type="dxa" w:w="5689"/>
           </w:tcPr>
           <w:p>
             <w:pPr>
@@ -9878,13 +12189,13 @@
               <w:rPr>
                 <w:sz w:val="19"/>
               </w:rPr>
-              <w:t>Showing the few most important things first and the rest one step deeper, on request, so the first screen stays clear.</w:t>
-            </w:r>
-          </w:p>
-        </w:tc>
-        <w:tc>
-          <w:tcPr>
-            <w:tcW w:type="dxa" w:w="1095"/>
+              <w:t>The one thing most people on a screen came to do, such as “Report damage”. It should be the easiest thing to see and press.</w:t>
+            </w:r>
+          </w:p>
+        </w:tc>
+        <w:tc>
+          <w:tcPr>
+            <w:tcW w:type="dxa" w:w="1096"/>
           </w:tcPr>
           <w:p>
             <w:pPr>
@@ -9910,7 +12221,7 @@
               <w:rPr>
                 <w:sz w:val="19"/>
               </w:rPr>
-              <w:t>Day 2</w:t>
+              <w:t>Day 1</w:t>
             </w:r>
           </w:p>
         </w:tc>
@@ -9921,7 +12232,7 @@
         </w:trPr>
         <w:tc>
           <w:tcPr>
-            <w:tcW w:type="dxa" w:w="1933"/>
+            <w:tcW w:type="dxa" w:w="1931"/>
           </w:tcPr>
           <w:p>
             <w:pPr>
@@ -9932,13 +12243,13 @@
                 <w:b/>
                 <w:sz w:val="19"/>
               </w:rPr>
-              <w:t>Reachability</w:t>
-            </w:r>
-          </w:p>
-        </w:tc>
-        <w:tc>
-          <w:tcPr>
-            <w:tcW w:type="dxa" w:w="5688"/>
+              <w:t>Progressive disclosure</w:t>
+            </w:r>
+          </w:p>
+        </w:tc>
+        <w:tc>
+          <w:tcPr>
+            <w:tcW w:type="dxa" w:w="5689"/>
           </w:tcPr>
           <w:p>
             <w:pPr>
@@ -9948,13 +12259,13 @@
               <w:rPr>
                 <w:sz w:val="19"/>
               </w:rPr>
-              <w:t>How easily a target can be reached and hit: its size, its distance from the hand or pointer, and the space around it.</w:t>
-            </w:r>
-          </w:p>
-        </w:tc>
-        <w:tc>
-          <w:tcPr>
-            <w:tcW w:type="dxa" w:w="1095"/>
+              <w:t>Showing the few most important things first and the rest one step deeper, on request, so the first screen stays clear.</w:t>
+            </w:r>
+          </w:p>
+        </w:tc>
+        <w:tc>
+          <w:tcPr>
+            <w:tcW w:type="dxa" w:w="1096"/>
           </w:tcPr>
           <w:p>
             <w:pPr>
@@ -9980,7 +12291,7 @@
               <w:rPr>
                 <w:sz w:val="19"/>
               </w:rPr>
-              <w:t>Day 5</w:t>
+              <w:t>Day 2</w:t>
             </w:r>
           </w:p>
         </w:tc>
@@ -9991,7 +12302,7 @@
         </w:trPr>
         <w:tc>
           <w:tcPr>
-            <w:tcW w:type="dxa" w:w="1933"/>
+            <w:tcW w:type="dxa" w:w="1931"/>
           </w:tcPr>
           <w:p>
             <w:pPr>
@@ -10002,13 +12313,13 @@
                 <w:b/>
                 <w:sz w:val="19"/>
               </w:rPr>
-              <w:t>Reaction time</w:t>
-            </w:r>
-          </w:p>
-        </w:tc>
-        <w:tc>
-          <w:tcPr>
-            <w:tcW w:type="dxa" w:w="5688"/>
+              <w:t>Reachability</w:t>
+            </w:r>
+          </w:p>
+        </w:tc>
+        <w:tc>
+          <w:tcPr>
+            <w:tcW w:type="dxa" w:w="5689"/>
           </w:tcPr>
           <w:p>
             <w:pPr>
@@ -10018,13 +12329,13 @@
               <w:rPr>
                 <w:sz w:val="19"/>
               </w:rPr>
-              <w:t>The time a person needs to see, decide and act. Each of the three laws adds to it in its own way.</w:t>
-            </w:r>
-          </w:p>
-        </w:tc>
-        <w:tc>
-          <w:tcPr>
-            <w:tcW w:type="dxa" w:w="1095"/>
+              <w:t>How easily a target can be reached and hit: its size, its distance from the hand or pointer, and the space around it.</w:t>
+            </w:r>
+          </w:p>
+        </w:tc>
+        <w:tc>
+          <w:tcPr>
+            <w:tcW w:type="dxa" w:w="1096"/>
           </w:tcPr>
           <w:p>
             <w:pPr>
@@ -10061,7 +12372,7 @@
         </w:trPr>
         <w:tc>
           <w:tcPr>
-            <w:tcW w:type="dxa" w:w="1933"/>
+            <w:tcW w:type="dxa" w:w="1931"/>
           </w:tcPr>
           <w:p>
             <w:pPr>
@@ -10072,13 +12383,13 @@
                 <w:b/>
                 <w:sz w:val="19"/>
               </w:rPr>
-              <w:t>Recognition instead of recall</w:t>
-            </w:r>
-          </w:p>
-        </w:tc>
-        <w:tc>
-          <w:tcPr>
-            <w:tcW w:type="dxa" w:w="5688"/>
+              <w:t>Reaction time</w:t>
+            </w:r>
+          </w:p>
+        </w:tc>
+        <w:tc>
+          <w:tcPr>
+            <w:tcW w:type="dxa" w:w="5689"/>
           </w:tcPr>
           <w:p>
             <w:pPr>
@@ -10088,13 +12399,13 @@
               <w:rPr>
                 <w:sz w:val="19"/>
               </w:rPr>
-              <w:t>Showing people the options and the next step so they can recognise them, instead of making them remember or hunt for them.</w:t>
-            </w:r>
-          </w:p>
-        </w:tc>
-        <w:tc>
-          <w:tcPr>
-            <w:tcW w:type="dxa" w:w="1095"/>
+              <w:t>The time a person needs to see, decide and act. Each of the three laws adds to it in its own way.</w:t>
+            </w:r>
+          </w:p>
+        </w:tc>
+        <w:tc>
+          <w:tcPr>
+            <w:tcW w:type="dxa" w:w="1096"/>
           </w:tcPr>
           <w:p>
             <w:pPr>
@@ -10120,7 +12431,7 @@
               <w:rPr>
                 <w:sz w:val="19"/>
               </w:rPr>
-              <w:t>Day 2</w:t>
+              <w:t>Day 5</w:t>
             </w:r>
           </w:p>
         </w:tc>
@@ -10131,7 +12442,7 @@
         </w:trPr>
         <w:tc>
           <w:tcPr>
-            <w:tcW w:type="dxa" w:w="1933"/>
+            <w:tcW w:type="dxa" w:w="1931"/>
           </w:tcPr>
           <w:p>
             <w:pPr>
@@ -10142,13 +12453,13 @@
                 <w:b/>
                 <w:sz w:val="19"/>
               </w:rPr>
-              <w:t>Staged choice</w:t>
-            </w:r>
-          </w:p>
-        </w:tc>
-        <w:tc>
-          <w:tcPr>
-            <w:tcW w:type="dxa" w:w="5688"/>
+              <w:t>Recognition instead of recall</w:t>
+            </w:r>
+          </w:p>
+        </w:tc>
+        <w:tc>
+          <w:tcPr>
+            <w:tcW w:type="dxa" w:w="5689"/>
           </w:tcPr>
           <w:p>
             <w:pPr>
@@ -10158,13 +12469,13 @@
               <w:rPr>
                 <w:sz w:val="19"/>
               </w:rPr>
-              <w:t>One large choice split into a few small ones, such as first the day, then the film, then the time. Each stage has few options; too many stages become a hurdle.</w:t>
-            </w:r>
-          </w:p>
-        </w:tc>
-        <w:tc>
-          <w:tcPr>
-            <w:tcW w:type="dxa" w:w="1095"/>
+              <w:t>Showing people the options and the next step so they can recognise them, instead of making them remember or hunt for them.</w:t>
+            </w:r>
+          </w:p>
+        </w:tc>
+        <w:tc>
+          <w:tcPr>
+            <w:tcW w:type="dxa" w:w="1096"/>
           </w:tcPr>
           <w:p>
             <w:pPr>
@@ -10190,7 +12501,7 @@
               <w:rPr>
                 <w:sz w:val="19"/>
               </w:rPr>
-              <w:t>Day 5</w:t>
+              <w:t>Day 2</w:t>
             </w:r>
           </w:p>
         </w:tc>
@@ -10201,7 +12512,7 @@
         </w:trPr>
         <w:tc>
           <w:tcPr>
-            <w:tcW w:type="dxa" w:w="1933"/>
+            <w:tcW w:type="dxa" w:w="1931"/>
           </w:tcPr>
           <w:p>
             <w:pPr>
@@ -10212,13 +12523,13 @@
                 <w:b/>
                 <w:sz w:val="19"/>
               </w:rPr>
-              <w:t>Thumb zone</w:t>
-            </w:r>
-          </w:p>
-        </w:tc>
-        <w:tc>
-          <w:tcPr>
-            <w:tcW w:type="dxa" w:w="5688"/>
+              <w:t>Staged choice</w:t>
+            </w:r>
+          </w:p>
+        </w:tc>
+        <w:tc>
+          <w:tcPr>
+            <w:tcW w:type="dxa" w:w="5689"/>
           </w:tcPr>
           <w:p>
             <w:pPr>
@@ -10228,13 +12539,13 @@
               <w:rPr>
                 <w:sz w:val="19"/>
               </w:rPr>
-              <w:t>The part of a phone screen the thumb reaches easily when the phone is held in one hand, usually the lower middle. The top corners are hard to reach.</w:t>
-            </w:r>
-          </w:p>
-        </w:tc>
-        <w:tc>
-          <w:tcPr>
-            <w:tcW w:type="dxa" w:w="1095"/>
+              <w:t>One large choice split into a few small ones, such as first the day, then the film, then the time. Each stage has few options; too many stages become a hurdle.</w:t>
+            </w:r>
+          </w:p>
+        </w:tc>
+        <w:tc>
+          <w:tcPr>
+            <w:tcW w:type="dxa" w:w="1096"/>
           </w:tcPr>
           <w:p>
             <w:pPr>
@@ -10271,7 +12582,7 @@
         </w:trPr>
         <w:tc>
           <w:tcPr>
-            <w:tcW w:type="dxa" w:w="1933"/>
+            <w:tcW w:type="dxa" w:w="1931"/>
           </w:tcPr>
           <w:p>
             <w:pPr>
@@ -10282,13 +12593,13 @@
                 <w:b/>
                 <w:sz w:val="19"/>
               </w:rPr>
-              <w:t>Touch target</w:t>
-            </w:r>
-          </w:p>
-        </w:tc>
-        <w:tc>
-          <w:tcPr>
-            <w:tcW w:type="dxa" w:w="5688"/>
+              <w:t>Thumb zone</w:t>
+            </w:r>
+          </w:p>
+        </w:tc>
+        <w:tc>
+          <w:tcPr>
+            <w:tcW w:type="dxa" w:w="5689"/>
           </w:tcPr>
           <w:p>
             <w:pPr>
@@ -10298,13 +12609,13 @@
               <w:rPr>
                 <w:sz w:val="19"/>
               </w:rPr>
-              <w:t>The area of a button or link that reacts to a tap or a click. It can be larger than the visible label; too small, and people miss it.</w:t>
-            </w:r>
-          </w:p>
-        </w:tc>
-        <w:tc>
-          <w:tcPr>
-            <w:tcW w:type="dxa" w:w="1095"/>
+              <w:t>The part of a phone screen the thumb reaches easily when the phone is held in one hand, usually the lower middle. The top corners are hard to reach.</w:t>
+            </w:r>
+          </w:p>
+        </w:tc>
+        <w:tc>
+          <w:tcPr>
+            <w:tcW w:type="dxa" w:w="1096"/>
           </w:tcPr>
           <w:p>
             <w:pPr>
@@ -10341,7 +12652,7 @@
         </w:trPr>
         <w:tc>
           <w:tcPr>
-            <w:tcW w:type="dxa" w:w="1933"/>
+            <w:tcW w:type="dxa" w:w="1931"/>
           </w:tcPr>
           <w:p>
             <w:pPr>
@@ -10352,13 +12663,13 @@
                 <w:b/>
                 <w:sz w:val="19"/>
               </w:rPr>
-              <w:t>UX (user experience)</w:t>
-            </w:r>
-          </w:p>
-        </w:tc>
-        <w:tc>
-          <w:tcPr>
-            <w:tcW w:type="dxa" w:w="5688"/>
+              <w:t>Touch target</w:t>
+            </w:r>
+          </w:p>
+        </w:tc>
+        <w:tc>
+          <w:tcPr>
+            <w:tcW w:type="dxa" w:w="5689"/>
           </w:tcPr>
           <w:p>
             <w:pPr>
@@ -10368,13 +12679,13 @@
               <w:rPr>
                 <w:sz w:val="19"/>
               </w:rPr>
-              <w:t>Everything a person goes through when using a product: what they notice, understand, feel and do, from the first look to the last step. The screens are only one part of it.</w:t>
-            </w:r>
-          </w:p>
-        </w:tc>
-        <w:tc>
-          <w:tcPr>
-            <w:tcW w:type="dxa" w:w="1095"/>
+              <w:t>The area of a button or link that reacts to a tap or a click. It can be larger than the visible label; too small, and people miss it.</w:t>
+            </w:r>
+          </w:p>
+        </w:tc>
+        <w:tc>
+          <w:tcPr>
+            <w:tcW w:type="dxa" w:w="1096"/>
           </w:tcPr>
           <w:p>
             <w:pPr>
@@ -10384,7 +12695,7 @@
               <w:rPr>
                 <w:sz w:val="19"/>
               </w:rPr>
-              <w:t>Finding the booking you want at once and feeling sure it went through is a good UX.</w:t>
+              <w:t>—</w:t>
             </w:r>
           </w:p>
         </w:tc>
@@ -10400,7 +12711,7 @@
               <w:rPr>
                 <w:sz w:val="19"/>
               </w:rPr>
-              <w:t>Day 1</w:t>
+              <w:t>Day 5</w:t>
             </w:r>
           </w:p>
         </w:tc>
@@ -10411,7 +12722,7 @@
         </w:trPr>
         <w:tc>
           <w:tcPr>
-            <w:tcW w:type="dxa" w:w="1933"/>
+            <w:tcW w:type="dxa" w:w="1931"/>
           </w:tcPr>
           <w:p>
             <w:pPr>
@@ -10422,13 +12733,83 @@
                 <w:b/>
                 <w:sz w:val="19"/>
               </w:rPr>
+              <w:t>UX (user experience)</w:t>
+            </w:r>
+          </w:p>
+        </w:tc>
+        <w:tc>
+          <w:tcPr>
+            <w:tcW w:type="dxa" w:w="5689"/>
+          </w:tcPr>
+          <w:p>
+            <w:pPr>
+              <w:spacing w:before="0" w:after="0"/>
+            </w:pPr>
+            <w:r>
+              <w:rPr>
+                <w:sz w:val="19"/>
+              </w:rPr>
+              <w:t>Everything a person goes through when using a product: what they notice, understand, feel and do, from the first look to the last step. The screens are only one part of it.</w:t>
+            </w:r>
+          </w:p>
+        </w:tc>
+        <w:tc>
+          <w:tcPr>
+            <w:tcW w:type="dxa" w:w="1096"/>
+          </w:tcPr>
+          <w:p>
+            <w:pPr>
+              <w:spacing w:before="0" w:after="0"/>
+            </w:pPr>
+            <w:r>
+              <w:rPr>
+                <w:sz w:val="19"/>
+              </w:rPr>
+              <w:t>Finding the booking you want at once and feeling sure it went through is a good UX.</w:t>
+            </w:r>
+          </w:p>
+        </w:tc>
+        <w:tc>
+          <w:tcPr>
+            <w:tcW w:type="dxa" w:w="922"/>
+          </w:tcPr>
+          <w:p>
+            <w:pPr>
+              <w:spacing w:before="0" w:after="0"/>
+            </w:pPr>
+            <w:r>
+              <w:rPr>
+                <w:sz w:val="19"/>
+              </w:rPr>
+              <w:t>Day 1</w:t>
+            </w:r>
+          </w:p>
+        </w:tc>
+      </w:tr>
+      <w:tr>
+        <w:trPr>
+          <w:cantSplit/>
+        </w:trPr>
+        <w:tc>
+          <w:tcPr>
+            <w:tcW w:type="dxa" w:w="1931"/>
+          </w:tcPr>
+          <w:p>
+            <w:pPr>
+              <w:spacing w:before="0" w:after="0"/>
+            </w:pPr>
+            <w:r>
+              <w:rPr>
+                <w:b/>
+                <w:sz w:val="19"/>
+              </w:rPr>
               <w:t>Working memory</w:t>
             </w:r>
           </w:p>
         </w:tc>
         <w:tc>
           <w:tcPr>
-            <w:tcW w:type="dxa" w:w="5688"/>
+            <w:tcW w:type="dxa" w:w="5689"/>
           </w:tcPr>
           <w:p>
             <w:pPr>
@@ -10444,7 +12825,7 @@
         </w:tc>
         <w:tc>
           <w:tcPr>
-            <w:tcW w:type="dxa" w:w="1095"/>
+            <w:tcW w:type="dxa" w:w="1096"/>
           </w:tcPr>
           <w:p>
             <w:pPr>

</xml_diff>